<commit_message>
MAJ instrcution malik therique
</commit_message>
<xml_diff>
--- a/Rapport Medialise.docx
+++ b/Rapport Medialise.docx
@@ -18,8 +18,13 @@
     <w:p>
       <w:r>
         <w:lastRenderedPageBreak/>
-        <w:t>Projet choisi de base MedicSearch</w:t>
-      </w:r>
+        <w:t xml:space="preserve">Projet choisi de base </w:t>
+      </w:r>
+      <w:proofErr w:type="spellStart"/>
+      <w:r>
+        <w:t>MedicSearch</w:t>
+      </w:r>
+      <w:proofErr w:type="spellEnd"/>
     </w:p>
     <w:p>
       <w:r>
@@ -56,7 +61,7 @@
                     <pic:cNvPicPr/>
                   </pic:nvPicPr>
                   <pic:blipFill>
-                    <a:blip r:embed="rId4"/>
+                    <a:blip r:embed="rId5"/>
                     <a:stretch>
                       <a:fillRect/>
                     </a:stretch>
@@ -98,7 +103,7 @@
                     <pic:cNvPicPr/>
                   </pic:nvPicPr>
                   <pic:blipFill>
-                    <a:blip r:embed="rId5"/>
+                    <a:blip r:embed="rId6"/>
                     <a:stretch>
                       <a:fillRect/>
                     </a:stretch>
@@ -122,7 +127,23 @@
     <w:p/>
     <w:p>
       <w:r>
-        <w:t>Que va-t-on faire c’est de créer un dossier scrappers avec les sous-dossiers suivants qui vont permettre d’organiser un minimum psossible :</w:t>
+        <w:t xml:space="preserve">Que va-t-on faire c’est de créer un dossier </w:t>
+      </w:r>
+      <w:proofErr w:type="spellStart"/>
+      <w:r>
+        <w:t>scrappers</w:t>
+      </w:r>
+      <w:proofErr w:type="spellEnd"/>
+      <w:r>
+        <w:t xml:space="preserve"> avec les sous-dossiers suivants qui vont permettre d’organiser un minimum </w:t>
+      </w:r>
+      <w:proofErr w:type="spellStart"/>
+      <w:r>
+        <w:t>psossible</w:t>
+      </w:r>
+      <w:proofErr w:type="spellEnd"/>
+      <w:r>
+        <w:t xml:space="preserve"> :</w:t>
       </w:r>
       <w:r>
         <w:br/>
@@ -147,7 +168,7 @@
                     <pic:cNvPicPr/>
                   </pic:nvPicPr>
                   <pic:blipFill>
-                    <a:blip r:embed="rId6"/>
+                    <a:blip r:embed="rId7"/>
                     <a:stretch>
                       <a:fillRect/>
                     </a:stretch>
@@ -199,7 +220,7 @@
                     <pic:cNvPicPr/>
                   </pic:nvPicPr>
                   <pic:blipFill>
-                    <a:blip r:embed="rId7"/>
+                    <a:blip r:embed="rId8"/>
                     <a:stretch>
                       <a:fillRect/>
                     </a:stretch>
@@ -237,7 +258,39 @@
     <w:p/>
     <w:p>
       <w:r>
-        <w:t>Adaptation du projet complet avec l’ajout d’Agno et la migrations de fichier de scrapping de l’ancienne structure vers la nouvelle on a quand meme pas mal de correction à apporter comme le fais de corrigé ce fichier html qui ne contient meme pas de js séparer et qui font à deux presque 700 lignes.</w:t>
+        <w:t xml:space="preserve">Adaptation du projet complet avec l’ajout d’Agno et la migrations de fichier de </w:t>
+      </w:r>
+      <w:proofErr w:type="spellStart"/>
+      <w:r>
+        <w:t>scrapping</w:t>
+      </w:r>
+      <w:proofErr w:type="spellEnd"/>
+      <w:r>
+        <w:t xml:space="preserve"> de l’ancienne structure vers la nouvelle on a quand </w:t>
+      </w:r>
+      <w:proofErr w:type="spellStart"/>
+      <w:r>
+        <w:t>meme</w:t>
+      </w:r>
+      <w:proofErr w:type="spellEnd"/>
+      <w:r>
+        <w:t xml:space="preserve"> pas mal de correction à apporter comme le fais de corrigé ce fichier html qui ne contient </w:t>
+      </w:r>
+      <w:proofErr w:type="spellStart"/>
+      <w:r>
+        <w:t>meme</w:t>
+      </w:r>
+      <w:proofErr w:type="spellEnd"/>
+      <w:r>
+        <w:t xml:space="preserve"> pas de </w:t>
+      </w:r>
+      <w:proofErr w:type="spellStart"/>
+      <w:r>
+        <w:t>js</w:t>
+      </w:r>
+      <w:proofErr w:type="spellEnd"/>
+      <w:r>
+        <w:t xml:space="preserve"> séparer et qui font à deux presque 700 lignes.</w:t>
       </w:r>
       <w:r>
         <w:rPr>
@@ -259,7 +312,7 @@
                     <pic:cNvPicPr/>
                   </pic:nvPicPr>
                   <pic:blipFill>
-                    <a:blip r:embed="rId8"/>
+                    <a:blip r:embed="rId9"/>
                     <a:stretch>
                       <a:fillRect/>
                     </a:stretch>
@@ -287,7 +340,15 @@
       </w:r>
       <w:r>
         <w:br/>
-        <w:t xml:space="preserve">Apres implementation de Agno : </w:t>
+        <w:t xml:space="preserve">Apres </w:t>
+      </w:r>
+      <w:proofErr w:type="spellStart"/>
+      <w:r>
+        <w:t>implementation</w:t>
+      </w:r>
+      <w:proofErr w:type="spellEnd"/>
+      <w:r>
+        <w:t xml:space="preserve"> de Agno : </w:t>
       </w:r>
     </w:p>
     <w:p>
@@ -299,6 +360,9 @@
         <w:br/>
       </w:r>
       <w:r>
+        <w:rPr>
+          <w:noProof/>
+        </w:rPr>
         <w:drawing>
           <wp:inline distT="0" distB="0" distL="0" distR="0" wp14:anchorId="42E11EC2" wp14:editId="34CAD4D9">
             <wp:extent cx="5760720" cy="4537710"/>
@@ -315,7 +379,7 @@
                     <pic:cNvPicPr/>
                   </pic:nvPicPr>
                   <pic:blipFill>
-                    <a:blip r:embed="rId9"/>
+                    <a:blip r:embed="rId10"/>
                     <a:stretch>
                       <a:fillRect/>
                     </a:stretch>
@@ -345,6 +409,9 @@
     </w:p>
     <w:p>
       <w:r>
+        <w:rPr>
+          <w:noProof/>
+        </w:rPr>
         <w:drawing>
           <wp:inline distT="0" distB="0" distL="0" distR="0" wp14:anchorId="1EF53ADB" wp14:editId="5DFF76F0">
             <wp:extent cx="3762900" cy="2400635"/>
@@ -361,7 +428,7 @@
                     <pic:cNvPicPr/>
                   </pic:nvPicPr>
                   <pic:blipFill>
-                    <a:blip r:embed="rId10"/>
+                    <a:blip r:embed="rId11"/>
                     <a:stretch>
                       <a:fillRect/>
                     </a:stretch>
@@ -394,6 +461,1823 @@
         <w:br/>
       </w:r>
     </w:p>
+    <w:p>
+      <w:pPr>
+        <w:rPr>
+          <w:b/>
+          <w:bCs/>
+        </w:rPr>
+      </w:pPr>
+      <w:r>
+        <w:rPr>
+          <w:b/>
+          <w:bCs/>
+        </w:rPr>
+        <w:lastRenderedPageBreak/>
+        <w:t>PARTIE THÉRIAQUE — SCRAPING DES INTERACTIONS MÉDICAMENTEUSES</w:t>
+      </w:r>
+    </w:p>
+    <w:p>
+      <w:pPr>
+        <w:rPr>
+          <w:b/>
+          <w:bCs/>
+        </w:rPr>
+      </w:pPr>
+      <w:r>
+        <w:rPr>
+          <w:rFonts w:ascii="Segoe UI Emoji" w:hAnsi="Segoe UI Emoji" w:cs="Segoe UI Emoji"/>
+          <w:b/>
+          <w:bCs/>
+        </w:rPr>
+        <w:t>🎯</w:t>
+      </w:r>
+      <w:r>
+        <w:rPr>
+          <w:b/>
+          <w:bCs/>
+        </w:rPr>
+        <w:t xml:space="preserve"> Objectif</w:t>
+      </w:r>
+    </w:p>
+    <w:p>
+      <w:r>
+        <w:t xml:space="preserve">Scraper et intégrer dans MongoDB les </w:t>
+      </w:r>
+      <w:r>
+        <w:rPr>
+          <w:b/>
+          <w:bCs/>
+        </w:rPr>
+        <w:t>interactions médicamenteuses Thériaque</w:t>
+      </w:r>
+      <w:r>
+        <w:br/>
+        <w:t>(utiles à l’aide à la prescription pour les professionnels de santé).</w:t>
+      </w:r>
+    </w:p>
+    <w:p>
+      <w:r>
+        <w:rPr>
+          <w:rFonts w:ascii="Segoe UI Emoji" w:hAnsi="Segoe UI Emoji" w:cs="Segoe UI Emoji"/>
+        </w:rPr>
+        <w:t>⚠️</w:t>
+      </w:r>
+      <w:r>
+        <w:t xml:space="preserve"> </w:t>
+      </w:r>
+      <w:r>
+        <w:rPr>
+          <w:b/>
+          <w:bCs/>
+        </w:rPr>
+        <w:t>Thériaque nécessite une authentification</w:t>
+      </w:r>
+      <w:r>
+        <w:br/>
+      </w:r>
+      <w:r>
+        <w:rPr>
+          <w:rFonts w:ascii="Segoe UI Emoji" w:hAnsi="Segoe UI Emoji" w:cs="Segoe UI Emoji"/>
+        </w:rPr>
+        <w:t>➡️</w:t>
+      </w:r>
+      <w:r>
+        <w:t xml:space="preserve"> Le </w:t>
+      </w:r>
+      <w:proofErr w:type="spellStart"/>
+      <w:r>
+        <w:t>scraping</w:t>
+      </w:r>
+      <w:proofErr w:type="spellEnd"/>
+      <w:r>
+        <w:t xml:space="preserve"> </w:t>
+      </w:r>
+      <w:r>
+        <w:rPr>
+          <w:b/>
+          <w:bCs/>
+        </w:rPr>
+        <w:t>NE FONCTIONNE PAS</w:t>
+      </w:r>
+      <w:r>
+        <w:t xml:space="preserve"> sans être connecté.</w:t>
+      </w:r>
+    </w:p>
+    <w:p>
+      <w:r>
+        <w:pict w14:anchorId="5A5FB97E">
+          <v:rect id="_x0000_i1085" style="width:0;height:1.5pt" o:hralign="center" o:hrstd="t" o:hr="t" fillcolor="#a0a0a0" stroked="f"/>
+        </w:pict>
+      </w:r>
+    </w:p>
+    <w:p>
+      <w:pPr>
+        <w:rPr>
+          <w:b/>
+          <w:bCs/>
+        </w:rPr>
+      </w:pPr>
+      <w:r>
+        <w:rPr>
+          <w:b/>
+          <w:bCs/>
+        </w:rPr>
+        <w:t>1️</w:t>
+      </w:r>
+      <w:r>
+        <w:rPr>
+          <w:rFonts w:ascii="Segoe UI Symbol" w:hAnsi="Segoe UI Symbol" w:cs="Segoe UI Symbol"/>
+          <w:b/>
+          <w:bCs/>
+        </w:rPr>
+        <w:t>⃣</w:t>
+      </w:r>
+      <w:r>
+        <w:rPr>
+          <w:b/>
+          <w:bCs/>
+        </w:rPr>
+        <w:t xml:space="preserve"> Créer un compte Thériaque (obligatoire)</w:t>
+      </w:r>
+    </w:p>
+    <w:p>
+      <w:pPr>
+        <w:numPr>
+          <w:ilvl w:val="0"/>
+          <w:numId w:val="1"/>
+        </w:numPr>
+      </w:pPr>
+      <w:r>
+        <w:t>Aller sur :</w:t>
+      </w:r>
+      <w:r>
+        <w:br/>
+      </w:r>
+      <w:r>
+        <w:rPr>
+          <w:rFonts w:ascii="Segoe UI Emoji" w:hAnsi="Segoe UI Emoji" w:cs="Segoe UI Emoji"/>
+        </w:rPr>
+        <w:t>👉</w:t>
+      </w:r>
+      <w:r>
+        <w:t xml:space="preserve"> </w:t>
+      </w:r>
+      <w:hyperlink r:id="rId12" w:tgtFrame="_new" w:history="1">
+        <w:r>
+          <w:rPr>
+            <w:rStyle w:val="Lienhypertexte"/>
+          </w:rPr>
+          <w:t>https://www.theriaque.org</w:t>
+        </w:r>
+      </w:hyperlink>
+    </w:p>
+    <w:p>
+      <w:pPr>
+        <w:numPr>
+          <w:ilvl w:val="0"/>
+          <w:numId w:val="1"/>
+        </w:numPr>
+      </w:pPr>
+      <w:r>
+        <w:t xml:space="preserve">Cliquer sur </w:t>
+      </w:r>
+      <w:r>
+        <w:rPr>
+          <w:b/>
+          <w:bCs/>
+        </w:rPr>
+        <w:t>Créer un compte</w:t>
+      </w:r>
+    </w:p>
+    <w:p>
+      <w:pPr>
+        <w:numPr>
+          <w:ilvl w:val="0"/>
+          <w:numId w:val="1"/>
+        </w:numPr>
+      </w:pPr>
+      <w:r>
+        <w:t>Finaliser l’inscription</w:t>
+      </w:r>
+    </w:p>
+    <w:p>
+      <w:pPr>
+        <w:numPr>
+          <w:ilvl w:val="0"/>
+          <w:numId w:val="1"/>
+        </w:numPr>
+      </w:pPr>
+      <w:r>
+        <w:t>Se connecter avec le compte créé</w:t>
+      </w:r>
+    </w:p>
+    <w:p>
+      <w:r>
+        <w:rPr>
+          <w:rFonts w:ascii="Segoe UI Emoji" w:hAnsi="Segoe UI Emoji" w:cs="Segoe UI Emoji"/>
+        </w:rPr>
+        <w:t>✅</w:t>
+      </w:r>
+      <w:r>
+        <w:t xml:space="preserve"> Tant que tu peux accéder à la recherche et aux monographies, c’est bon.</w:t>
+      </w:r>
+    </w:p>
+    <w:p>
+      <w:r>
+        <w:pict w14:anchorId="255BED18">
+          <v:rect id="_x0000_i1086" style="width:0;height:1.5pt" o:hralign="center" o:hrstd="t" o:hr="t" fillcolor="#a0a0a0" stroked="f"/>
+        </w:pict>
+      </w:r>
+    </w:p>
+    <w:p>
+      <w:pPr>
+        <w:rPr>
+          <w:b/>
+          <w:bCs/>
+        </w:rPr>
+      </w:pPr>
+      <w:r>
+        <w:rPr>
+          <w:b/>
+          <w:bCs/>
+        </w:rPr>
+        <w:t>2️</w:t>
+      </w:r>
+      <w:r>
+        <w:rPr>
+          <w:rFonts w:ascii="Segoe UI Symbol" w:hAnsi="Segoe UI Symbol" w:cs="Segoe UI Symbol"/>
+          <w:b/>
+          <w:bCs/>
+        </w:rPr>
+        <w:t>⃣</w:t>
+      </w:r>
+      <w:r>
+        <w:rPr>
+          <w:b/>
+          <w:bCs/>
+        </w:rPr>
+        <w:t xml:space="preserve"> Se connecter et récupérer les cookies (ÉTAPE CRITIQUE)</w:t>
+      </w:r>
+    </w:p>
+    <w:p>
+      <w:pPr>
+        <w:rPr>
+          <w:b/>
+          <w:bCs/>
+        </w:rPr>
+      </w:pPr>
+      <w:r>
+        <w:rPr>
+          <w:b/>
+          <w:bCs/>
+        </w:rPr>
+        <w:t xml:space="preserve">Ouvrir les </w:t>
+      </w:r>
+      <w:proofErr w:type="spellStart"/>
+      <w:r>
+        <w:rPr>
+          <w:b/>
+          <w:bCs/>
+        </w:rPr>
+        <w:t>DevTools</w:t>
+      </w:r>
+      <w:proofErr w:type="spellEnd"/>
+    </w:p>
+    <w:p>
+      <w:pPr>
+        <w:numPr>
+          <w:ilvl w:val="0"/>
+          <w:numId w:val="2"/>
+        </w:numPr>
+      </w:pPr>
+      <w:r>
+        <w:t>Sur le site Thériaque (connecté)</w:t>
+      </w:r>
+    </w:p>
+    <w:p>
+      <w:pPr>
+        <w:numPr>
+          <w:ilvl w:val="0"/>
+          <w:numId w:val="2"/>
+        </w:numPr>
+      </w:pPr>
+      <w:r>
+        <w:t xml:space="preserve">Appuyer sur </w:t>
+      </w:r>
+      <w:r>
+        <w:rPr>
+          <w:b/>
+          <w:bCs/>
+        </w:rPr>
+        <w:t>F12</w:t>
+      </w:r>
+    </w:p>
+    <w:p>
+      <w:pPr>
+        <w:numPr>
+          <w:ilvl w:val="0"/>
+          <w:numId w:val="2"/>
+        </w:numPr>
+      </w:pPr>
+      <w:r>
+        <w:t xml:space="preserve">Aller dans l’onglet </w:t>
+      </w:r>
+      <w:r>
+        <w:rPr>
+          <w:b/>
+          <w:bCs/>
+        </w:rPr>
+        <w:t>Application</w:t>
+      </w:r>
+    </w:p>
+    <w:p>
+      <w:pPr>
+        <w:rPr>
+          <w:b/>
+          <w:bCs/>
+        </w:rPr>
+      </w:pPr>
+      <w:r>
+        <w:rPr>
+          <w:b/>
+          <w:bCs/>
+        </w:rPr>
+        <w:t>Aller au bon endroit</w:t>
+      </w:r>
+    </w:p>
+    <w:p>
+      <w:r>
+        <w:t>Application</w:t>
+      </w:r>
+    </w:p>
+    <w:p>
+      <w:r>
+        <w:t xml:space="preserve"> └── Storage</w:t>
+      </w:r>
+    </w:p>
+    <w:p>
+      <w:r>
+        <w:t xml:space="preserve">     └── Cookies</w:t>
+      </w:r>
+    </w:p>
+    <w:p>
+      <w:r>
+        <w:t xml:space="preserve">         └── https://www.theriaque.org</w:t>
+      </w:r>
+    </w:p>
+    <w:p>
+      <w:pPr>
+        <w:rPr>
+          <w:b/>
+          <w:bCs/>
+        </w:rPr>
+      </w:pPr>
+      <w:r>
+        <w:rPr>
+          <w:b/>
+          <w:bCs/>
+        </w:rPr>
+        <w:t>Repérer CES DEUX COOKIES OBLIGATOIRES</w:t>
+      </w:r>
+    </w:p>
+    <w:tbl>
+      <w:tblPr>
+        <w:tblW w:w="0" w:type="auto"/>
+        <w:tblCellSpacing w:w="15" w:type="dxa"/>
+        <w:tblCellMar>
+          <w:top w:w="15" w:type="dxa"/>
+          <w:left w:w="15" w:type="dxa"/>
+          <w:bottom w:w="15" w:type="dxa"/>
+          <w:right w:w="15" w:type="dxa"/>
+        </w:tblCellMar>
+        <w:tblLook w:val="04A0" w:firstRow="1" w:lastRow="0" w:firstColumn="1" w:lastColumn="0" w:noHBand="0" w:noVBand="1"/>
+      </w:tblPr>
+      <w:tblGrid>
+        <w:gridCol w:w="1574"/>
+        <w:gridCol w:w="3004"/>
+      </w:tblGrid>
+      <w:tr>
+        <w:trPr>
+          <w:tblHeader/>
+          <w:tblCellSpacing w:w="15" w:type="dxa"/>
+        </w:trPr>
+        <w:tc>
+          <w:tcPr>
+            <w:tcW w:w="0" w:type="auto"/>
+            <w:vAlign w:val="center"/>
+            <w:hideMark/>
+          </w:tcPr>
+          <w:p>
+            <w:pPr>
+              <w:rPr>
+                <w:b/>
+                <w:bCs/>
+              </w:rPr>
+            </w:pPr>
+            <w:r>
+              <w:rPr>
+                <w:b/>
+                <w:bCs/>
+              </w:rPr>
+              <w:t>Nom du cookie</w:t>
+            </w:r>
+          </w:p>
+        </w:tc>
+        <w:tc>
+          <w:tcPr>
+            <w:tcW w:w="0" w:type="auto"/>
+            <w:vAlign w:val="center"/>
+            <w:hideMark/>
+          </w:tcPr>
+          <w:p>
+            <w:pPr>
+              <w:rPr>
+                <w:b/>
+                <w:bCs/>
+              </w:rPr>
+            </w:pPr>
+            <w:r>
+              <w:rPr>
+                <w:b/>
+                <w:bCs/>
+              </w:rPr>
+              <w:t>À quoi ça sert</w:t>
+            </w:r>
+          </w:p>
+        </w:tc>
+      </w:tr>
+      <w:tr>
+        <w:trPr>
+          <w:tblCellSpacing w:w="15" w:type="dxa"/>
+        </w:trPr>
+        <w:tc>
+          <w:tcPr>
+            <w:tcW w:w="0" w:type="auto"/>
+            <w:vAlign w:val="center"/>
+            <w:hideMark/>
+          </w:tcPr>
+          <w:p>
+            <w:r>
+              <w:t>PHPSESSID</w:t>
+            </w:r>
+          </w:p>
+        </w:tc>
+        <w:tc>
+          <w:tcPr>
+            <w:tcW w:w="0" w:type="auto"/>
+            <w:vAlign w:val="center"/>
+            <w:hideMark/>
+          </w:tcPr>
+          <w:p>
+            <w:r>
+              <w:t>Session utilisateur (obligatoire)</w:t>
+            </w:r>
+          </w:p>
+        </w:tc>
+      </w:tr>
+      <w:tr>
+        <w:trPr>
+          <w:tblCellSpacing w:w="15" w:type="dxa"/>
+        </w:trPr>
+        <w:tc>
+          <w:tcPr>
+            <w:tcW w:w="0" w:type="auto"/>
+            <w:vAlign w:val="center"/>
+            <w:hideMark/>
+          </w:tcPr>
+          <w:p>
+            <w:proofErr w:type="spellStart"/>
+            <w:r>
+              <w:t>authchallenge</w:t>
+            </w:r>
+            <w:proofErr w:type="spellEnd"/>
+          </w:p>
+        </w:tc>
+        <w:tc>
+          <w:tcPr>
+            <w:tcW w:w="0" w:type="auto"/>
+            <w:vAlign w:val="center"/>
+            <w:hideMark/>
+          </w:tcPr>
+          <w:p>
+            <w:r>
+              <w:t>Validation de l’authentification</w:t>
+            </w:r>
+          </w:p>
+        </w:tc>
+      </w:tr>
+    </w:tbl>
+    <w:p>
+      <w:r>
+        <w:rPr>
+          <w:rFonts w:ascii="Segoe UI Emoji" w:hAnsi="Segoe UI Emoji" w:cs="Segoe UI Emoji"/>
+        </w:rPr>
+        <w:t>📌</w:t>
+      </w:r>
+      <w:r>
+        <w:t xml:space="preserve"> Exemple (les valeurs changent à chaque connexion) :</w:t>
+      </w:r>
+    </w:p>
+    <w:p>
+      <w:r>
+        <w:t>PHPSESSID = u08k3p3hgi1ofk81livmsmct41</w:t>
+      </w:r>
+    </w:p>
+    <w:p>
+      <w:proofErr w:type="spellStart"/>
+      <w:r>
+        <w:lastRenderedPageBreak/>
+        <w:t>authchallenge</w:t>
+      </w:r>
+      <w:proofErr w:type="spellEnd"/>
+      <w:r>
+        <w:t xml:space="preserve"> = 84e5ba266524b37219dd6f48215d83eb</w:t>
+      </w:r>
+    </w:p>
+    <w:p>
+      <w:r>
+        <w:rPr>
+          <w:rFonts w:ascii="Segoe UI Emoji" w:hAnsi="Segoe UI Emoji" w:cs="Segoe UI Emoji"/>
+        </w:rPr>
+        <w:t>⚠️</w:t>
+      </w:r>
+      <w:r>
+        <w:t xml:space="preserve"> </w:t>
+      </w:r>
+      <w:r>
+        <w:rPr>
+          <w:b/>
+          <w:bCs/>
+        </w:rPr>
+        <w:t>IMPORTANT</w:t>
+      </w:r>
+    </w:p>
+    <w:p>
+      <w:pPr>
+        <w:numPr>
+          <w:ilvl w:val="0"/>
+          <w:numId w:val="3"/>
+        </w:numPr>
+      </w:pPr>
+      <w:r>
+        <w:t>Si tu te déconnectes → les cookies expirent</w:t>
+      </w:r>
+    </w:p>
+    <w:p>
+      <w:pPr>
+        <w:numPr>
+          <w:ilvl w:val="0"/>
+          <w:numId w:val="3"/>
+        </w:numPr>
+      </w:pPr>
+      <w:r>
+        <w:t xml:space="preserve">Il faudra </w:t>
+      </w:r>
+      <w:r>
+        <w:rPr>
+          <w:b/>
+          <w:bCs/>
+        </w:rPr>
+        <w:t>re-récupérer les valeurs</w:t>
+      </w:r>
+    </w:p>
+    <w:p>
+      <w:r>
+        <w:pict w14:anchorId="52A36EC9">
+          <v:rect id="_x0000_i1087" style="width:0;height:1.5pt" o:hralign="center" o:hrstd="t" o:hr="t" fillcolor="#a0a0a0" stroked="f"/>
+        </w:pict>
+      </w:r>
+    </w:p>
+    <w:p>
+      <w:pPr>
+        <w:rPr>
+          <w:b/>
+          <w:bCs/>
+        </w:rPr>
+      </w:pPr>
+      <w:r>
+        <w:rPr>
+          <w:b/>
+          <w:bCs/>
+        </w:rPr>
+        <w:t>3️</w:t>
+      </w:r>
+      <w:r>
+        <w:rPr>
+          <w:rFonts w:ascii="Segoe UI Symbol" w:hAnsi="Segoe UI Symbol" w:cs="Segoe UI Symbol"/>
+          <w:b/>
+          <w:bCs/>
+        </w:rPr>
+        <w:t>⃣</w:t>
+      </w:r>
+      <w:r>
+        <w:rPr>
+          <w:b/>
+          <w:bCs/>
+        </w:rPr>
+        <w:t xml:space="preserve"> Lancer le </w:t>
+      </w:r>
+      <w:proofErr w:type="spellStart"/>
+      <w:r>
+        <w:rPr>
+          <w:b/>
+          <w:bCs/>
+        </w:rPr>
+        <w:t>scraping</w:t>
+      </w:r>
+      <w:proofErr w:type="spellEnd"/>
+      <w:r>
+        <w:rPr>
+          <w:b/>
+          <w:bCs/>
+        </w:rPr>
+        <w:t xml:space="preserve"> Thériaque (TEST avec limite)</w:t>
+      </w:r>
+    </w:p>
+    <w:p>
+      <w:r>
+        <w:rPr>
+          <w:rFonts w:ascii="Segoe UI Emoji" w:hAnsi="Segoe UI Emoji" w:cs="Segoe UI Emoji"/>
+        </w:rPr>
+        <w:t>👉</w:t>
+      </w:r>
+      <w:r>
+        <w:t xml:space="preserve"> Commande </w:t>
+      </w:r>
+      <w:r>
+        <w:rPr>
+          <w:b/>
+          <w:bCs/>
+        </w:rPr>
+        <w:t>avec limite de 20 médicaments</w:t>
+      </w:r>
+      <w:r>
+        <w:t xml:space="preserve"> (recommandé pour tester)</w:t>
+      </w:r>
+    </w:p>
+    <w:p>
+      <w:r>
+        <w:t xml:space="preserve">python -m </w:t>
+      </w:r>
+      <w:proofErr w:type="spellStart"/>
+      <w:r>
+        <w:t>scrapers.run_agno</w:t>
+      </w:r>
+      <w:proofErr w:type="spellEnd"/>
+      <w:r>
+        <w:t xml:space="preserve"> --mode </w:t>
+      </w:r>
+      <w:proofErr w:type="spellStart"/>
+      <w:r>
+        <w:t>theriaque</w:t>
+      </w:r>
+      <w:proofErr w:type="spellEnd"/>
+      <w:r>
+        <w:t xml:space="preserve"> --</w:t>
+      </w:r>
+      <w:proofErr w:type="spellStart"/>
+      <w:r>
+        <w:t>limit</w:t>
+      </w:r>
+      <w:proofErr w:type="spellEnd"/>
+      <w:r>
+        <w:t xml:space="preserve"> 20 `</w:t>
+      </w:r>
+    </w:p>
+    <w:p>
+      <w:r>
+        <w:t xml:space="preserve">  --</w:t>
+      </w:r>
+      <w:proofErr w:type="spellStart"/>
+      <w:r>
+        <w:t>theriaque-phpsessid</w:t>
+      </w:r>
+      <w:proofErr w:type="spellEnd"/>
+      <w:r>
+        <w:t xml:space="preserve"> "TON_PHPSESSID_ICI" `</w:t>
+      </w:r>
+    </w:p>
+    <w:p>
+      <w:r>
+        <w:t xml:space="preserve">  --</w:t>
+      </w:r>
+      <w:proofErr w:type="spellStart"/>
+      <w:r>
+        <w:t>theriaque-authchallenge</w:t>
+      </w:r>
+      <w:proofErr w:type="spellEnd"/>
+      <w:r>
+        <w:t xml:space="preserve"> "TON_AUTHCHALLENGE_ICI"</w:t>
+      </w:r>
+    </w:p>
+    <w:p>
+      <w:pPr>
+        <w:rPr>
+          <w:b/>
+          <w:bCs/>
+        </w:rPr>
+      </w:pPr>
+      <w:r>
+        <w:rPr>
+          <w:b/>
+          <w:bCs/>
+        </w:rPr>
+        <w:t>Exemple réel</w:t>
+      </w:r>
+    </w:p>
+    <w:p>
+      <w:r>
+        <w:t xml:space="preserve">python -m </w:t>
+      </w:r>
+      <w:proofErr w:type="spellStart"/>
+      <w:r>
+        <w:t>scrapers.run_agno</w:t>
+      </w:r>
+      <w:proofErr w:type="spellEnd"/>
+      <w:r>
+        <w:t xml:space="preserve"> --mode </w:t>
+      </w:r>
+      <w:proofErr w:type="spellStart"/>
+      <w:r>
+        <w:t>theriaque</w:t>
+      </w:r>
+      <w:proofErr w:type="spellEnd"/>
+      <w:r>
+        <w:t xml:space="preserve"> --</w:t>
+      </w:r>
+      <w:proofErr w:type="spellStart"/>
+      <w:r>
+        <w:t>limit</w:t>
+      </w:r>
+      <w:proofErr w:type="spellEnd"/>
+      <w:r>
+        <w:t xml:space="preserve"> 20 `</w:t>
+      </w:r>
+    </w:p>
+    <w:p>
+      <w:r>
+        <w:t xml:space="preserve">  --</w:t>
+      </w:r>
+      <w:proofErr w:type="spellStart"/>
+      <w:r>
+        <w:t>theriaque-phpsessid</w:t>
+      </w:r>
+      <w:proofErr w:type="spellEnd"/>
+      <w:r>
+        <w:t xml:space="preserve"> "jjcg5klclajr13me3gs1s8r2d3" `</w:t>
+      </w:r>
+    </w:p>
+    <w:p>
+      <w:r>
+        <w:t xml:space="preserve">  --</w:t>
+      </w:r>
+      <w:proofErr w:type="spellStart"/>
+      <w:r>
+        <w:t>theriaque-authchallenge</w:t>
+      </w:r>
+      <w:proofErr w:type="spellEnd"/>
+      <w:r>
+        <w:t xml:space="preserve"> "2acec0c6a1e53d1d2c6d209558f15edc"</w:t>
+      </w:r>
+    </w:p>
+    <w:p>
+      <w:pPr>
+        <w:rPr>
+          <w:b/>
+          <w:bCs/>
+        </w:rPr>
+      </w:pPr>
+      <w:r>
+        <w:rPr>
+          <w:b/>
+          <w:bCs/>
+        </w:rPr>
+        <w:t>Ce que tu dois voir dans le terminal</w:t>
+      </w:r>
+    </w:p>
+    <w:p>
+      <w:r>
+        <w:t xml:space="preserve">[THERIAQUE] AUTH CHECK: </w:t>
+      </w:r>
+      <w:proofErr w:type="spellStart"/>
+      <w:r>
+        <w:t>logged</w:t>
+      </w:r>
+      <w:proofErr w:type="spellEnd"/>
+      <w:r>
+        <w:t xml:space="preserve"> in </w:t>
+      </w:r>
+      <w:r>
+        <w:rPr>
+          <w:rFonts w:ascii="Segoe UI Emoji" w:hAnsi="Segoe UI Emoji" w:cs="Segoe UI Emoji"/>
+        </w:rPr>
+        <w:t>✅</w:t>
+      </w:r>
+    </w:p>
+    <w:p>
+      <w:r>
+        <w:t>Enrichissement Thériaque INTER terminé.</w:t>
+      </w:r>
+    </w:p>
+    <w:p>
+      <w:r>
+        <w:t>- Docs scannés : 20</w:t>
+      </w:r>
+    </w:p>
+    <w:p>
+      <w:r>
+        <w:t>- Docs matchés : XX</w:t>
+      </w:r>
+    </w:p>
+    <w:p>
+      <w:r>
+        <w:t>- Docs modifiés: XX</w:t>
+      </w:r>
+    </w:p>
+    <w:p>
+      <w:r>
+        <w:rPr>
+          <w:rFonts w:ascii="Segoe UI Emoji" w:hAnsi="Segoe UI Emoji" w:cs="Segoe UI Emoji"/>
+        </w:rPr>
+        <w:t>✅</w:t>
+      </w:r>
+      <w:r>
+        <w:t xml:space="preserve"> Si tu vois </w:t>
+      </w:r>
+      <w:proofErr w:type="spellStart"/>
+      <w:r>
+        <w:t>logged</w:t>
+      </w:r>
+      <w:proofErr w:type="spellEnd"/>
+      <w:r>
+        <w:t xml:space="preserve"> in </w:t>
+      </w:r>
+      <w:r>
+        <w:rPr>
+          <w:rFonts w:ascii="Segoe UI Emoji" w:hAnsi="Segoe UI Emoji" w:cs="Segoe UI Emoji"/>
+        </w:rPr>
+        <w:t>✅</w:t>
+      </w:r>
+      <w:r>
+        <w:t>, l</w:t>
+      </w:r>
+      <w:r>
+        <w:rPr>
+          <w:rFonts w:ascii="Aptos" w:hAnsi="Aptos" w:cs="Aptos"/>
+        </w:rPr>
+        <w:t>’</w:t>
+      </w:r>
+      <w:r>
+        <w:t>authentification fonctionne.</w:t>
+      </w:r>
+    </w:p>
+    <w:p>
+      <w:r>
+        <w:pict w14:anchorId="62DDF048">
+          <v:rect id="_x0000_i1088" style="width:0;height:1.5pt" o:hralign="center" o:hrstd="t" o:hr="t" fillcolor="#a0a0a0" stroked="f"/>
+        </w:pict>
+      </w:r>
+    </w:p>
+    <w:p>
+      <w:pPr>
+        <w:rPr>
+          <w:b/>
+          <w:bCs/>
+        </w:rPr>
+      </w:pPr>
+      <w:r>
+        <w:rPr>
+          <w:b/>
+          <w:bCs/>
+        </w:rPr>
+        <w:t>4️</w:t>
+      </w:r>
+      <w:r>
+        <w:rPr>
+          <w:rFonts w:ascii="Segoe UI Symbol" w:hAnsi="Segoe UI Symbol" w:cs="Segoe UI Symbol"/>
+          <w:b/>
+          <w:bCs/>
+        </w:rPr>
+        <w:t>⃣</w:t>
+      </w:r>
+      <w:r>
+        <w:rPr>
+          <w:b/>
+          <w:bCs/>
+        </w:rPr>
+        <w:t xml:space="preserve"> Lancer le </w:t>
+      </w:r>
+      <w:proofErr w:type="spellStart"/>
+      <w:r>
+        <w:rPr>
+          <w:b/>
+          <w:bCs/>
+        </w:rPr>
+        <w:t>scraping</w:t>
+      </w:r>
+      <w:proofErr w:type="spellEnd"/>
+      <w:r>
+        <w:rPr>
+          <w:b/>
+          <w:bCs/>
+        </w:rPr>
+        <w:t xml:space="preserve"> COMPLET (sans limite)</w:t>
+      </w:r>
+    </w:p>
+    <w:p>
+      <w:r>
+        <w:rPr>
+          <w:rFonts w:ascii="Segoe UI Emoji" w:hAnsi="Segoe UI Emoji" w:cs="Segoe UI Emoji"/>
+        </w:rPr>
+        <w:t>⚠️</w:t>
+      </w:r>
+      <w:r>
+        <w:t xml:space="preserve"> À faire </w:t>
+      </w:r>
+      <w:r>
+        <w:rPr>
+          <w:b/>
+          <w:bCs/>
+        </w:rPr>
+        <w:t>uniquement après test OK</w:t>
+      </w:r>
+    </w:p>
+    <w:p>
+      <w:r>
+        <w:t xml:space="preserve">python -m </w:t>
+      </w:r>
+      <w:proofErr w:type="spellStart"/>
+      <w:r>
+        <w:t>scrapers.run_agno</w:t>
+      </w:r>
+      <w:proofErr w:type="spellEnd"/>
+      <w:r>
+        <w:t xml:space="preserve"> --mode </w:t>
+      </w:r>
+      <w:proofErr w:type="spellStart"/>
+      <w:r>
+        <w:t>theriaque</w:t>
+      </w:r>
+      <w:proofErr w:type="spellEnd"/>
+      <w:r>
+        <w:t xml:space="preserve"> `</w:t>
+      </w:r>
+    </w:p>
+    <w:p>
+      <w:r>
+        <w:t xml:space="preserve">  --</w:t>
+      </w:r>
+      <w:proofErr w:type="spellStart"/>
+      <w:r>
+        <w:t>theriaque-phpsessid</w:t>
+      </w:r>
+      <w:proofErr w:type="spellEnd"/>
+      <w:r>
+        <w:t xml:space="preserve"> "TON_PHPSESSID_ICI" `</w:t>
+      </w:r>
+    </w:p>
+    <w:p>
+      <w:r>
+        <w:t xml:space="preserve">  --</w:t>
+      </w:r>
+      <w:proofErr w:type="spellStart"/>
+      <w:r>
+        <w:t>theriaque-authchallenge</w:t>
+      </w:r>
+      <w:proofErr w:type="spellEnd"/>
+      <w:r>
+        <w:t xml:space="preserve"> "TON_AUTHCHALLENGE_ICI"</w:t>
+      </w:r>
+    </w:p>
+    <w:p>
+      <w:r>
+        <w:pict w14:anchorId="7757DD22">
+          <v:rect id="_x0000_i1089" style="width:0;height:1.5pt" o:hralign="center" o:hrstd="t" o:hr="t" fillcolor="#a0a0a0" stroked="f"/>
+        </w:pict>
+      </w:r>
+    </w:p>
+    <w:p>
+      <w:pPr>
+        <w:rPr>
+          <w:b/>
+          <w:bCs/>
+        </w:rPr>
+      </w:pPr>
+      <w:r>
+        <w:rPr>
+          <w:b/>
+          <w:bCs/>
+        </w:rPr>
+        <w:t>5️</w:t>
+      </w:r>
+      <w:r>
+        <w:rPr>
+          <w:rFonts w:ascii="Segoe UI Symbol" w:hAnsi="Segoe UI Symbol" w:cs="Segoe UI Symbol"/>
+          <w:b/>
+          <w:bCs/>
+        </w:rPr>
+        <w:t>⃣</w:t>
+      </w:r>
+      <w:r>
+        <w:rPr>
+          <w:b/>
+          <w:bCs/>
+        </w:rPr>
+        <w:t xml:space="preserve"> Vérifier dans MongoDB Compass que ça a bien scrappé</w:t>
+      </w:r>
+    </w:p>
+    <w:p>
+      <w:pPr>
+        <w:rPr>
+          <w:b/>
+          <w:bCs/>
+        </w:rPr>
+      </w:pPr>
+      <w:r>
+        <w:rPr>
+          <w:b/>
+          <w:bCs/>
+        </w:rPr>
+        <w:t>Collection</w:t>
+      </w:r>
+    </w:p>
+    <w:p>
+      <w:proofErr w:type="spellStart"/>
+      <w:r>
+        <w:lastRenderedPageBreak/>
+        <w:t>medicsearch.medicines</w:t>
+      </w:r>
+      <w:proofErr w:type="spellEnd"/>
+    </w:p>
+    <w:p>
+      <w:pPr>
+        <w:rPr>
+          <w:b/>
+          <w:bCs/>
+        </w:rPr>
+      </w:pPr>
+      <w:r>
+        <w:rPr>
+          <w:b/>
+          <w:bCs/>
+        </w:rPr>
+        <w:t>Filtre pour voir les docs enrichis Thériaque</w:t>
+      </w:r>
+    </w:p>
+    <w:p>
+      <w:r>
+        <w:t>{</w:t>
+      </w:r>
+    </w:p>
+    <w:p>
+      <w:r>
+        <w:t xml:space="preserve">  "</w:t>
+      </w:r>
+      <w:proofErr w:type="spellStart"/>
+      <w:r>
+        <w:t>theriaque</w:t>
+      </w:r>
+      <w:proofErr w:type="spellEnd"/>
+      <w:r>
+        <w:t>": { "$</w:t>
+      </w:r>
+      <w:proofErr w:type="spellStart"/>
+      <w:r>
+        <w:t>exists</w:t>
+      </w:r>
+      <w:proofErr w:type="spellEnd"/>
+      <w:r>
+        <w:t xml:space="preserve">": </w:t>
+      </w:r>
+      <w:proofErr w:type="spellStart"/>
+      <w:r>
+        <w:t>true</w:t>
+      </w:r>
+      <w:proofErr w:type="spellEnd"/>
+      <w:r>
+        <w:t xml:space="preserve"> }</w:t>
+      </w:r>
+    </w:p>
+    <w:p>
+      <w:r>
+        <w:t>}</w:t>
+      </w:r>
+    </w:p>
+    <w:p>
+      <w:pPr>
+        <w:rPr>
+          <w:b/>
+          <w:bCs/>
+        </w:rPr>
+      </w:pPr>
+      <w:r>
+        <w:rPr>
+          <w:b/>
+          <w:bCs/>
+        </w:rPr>
+        <w:t>Filtre pour voir uniquement les interactions textuelles propres</w:t>
+      </w:r>
+    </w:p>
+    <w:p>
+      <w:r>
+        <w:t>{</w:t>
+      </w:r>
+    </w:p>
+    <w:p>
+      <w:r>
+        <w:t xml:space="preserve">  "</w:t>
+      </w:r>
+      <w:proofErr w:type="spellStart"/>
+      <w:r>
+        <w:t>theriaque.interactions.text</w:t>
+      </w:r>
+      <w:proofErr w:type="spellEnd"/>
+      <w:r>
+        <w:t>": { "$</w:t>
+      </w:r>
+      <w:proofErr w:type="spellStart"/>
+      <w:r>
+        <w:t>exists</w:t>
+      </w:r>
+      <w:proofErr w:type="spellEnd"/>
+      <w:r>
+        <w:t xml:space="preserve">": </w:t>
+      </w:r>
+      <w:proofErr w:type="spellStart"/>
+      <w:r>
+        <w:t>true</w:t>
+      </w:r>
+      <w:proofErr w:type="spellEnd"/>
+      <w:r>
+        <w:t>, "$ne": "" }</w:t>
+      </w:r>
+    </w:p>
+    <w:p>
+      <w:r>
+        <w:t>}</w:t>
+      </w:r>
+    </w:p>
+    <w:p>
+      <w:pPr>
+        <w:rPr>
+          <w:b/>
+          <w:bCs/>
+        </w:rPr>
+      </w:pPr>
+      <w:r>
+        <w:rPr>
+          <w:b/>
+          <w:bCs/>
+        </w:rPr>
+        <w:t xml:space="preserve">Exemple de structure attendue (OK </w:t>
+      </w:r>
+      <w:r>
+        <w:rPr>
+          <w:rFonts w:ascii="Segoe UI Emoji" w:hAnsi="Segoe UI Emoji" w:cs="Segoe UI Emoji"/>
+          <w:b/>
+          <w:bCs/>
+        </w:rPr>
+        <w:t>✅</w:t>
+      </w:r>
+      <w:r>
+        <w:rPr>
+          <w:b/>
+          <w:bCs/>
+        </w:rPr>
+        <w:t>)</w:t>
+      </w:r>
+    </w:p>
+    <w:p>
+      <w:r>
+        <w:t>"</w:t>
+      </w:r>
+      <w:proofErr w:type="spellStart"/>
+      <w:r>
+        <w:t>theriaque</w:t>
+      </w:r>
+      <w:proofErr w:type="spellEnd"/>
+      <w:r>
+        <w:t>": {</w:t>
+      </w:r>
+    </w:p>
+    <w:p>
+      <w:r>
+        <w:t xml:space="preserve">  "</w:t>
+      </w:r>
+      <w:proofErr w:type="spellStart"/>
+      <w:r>
+        <w:t>meta</w:t>
+      </w:r>
+      <w:proofErr w:type="spellEnd"/>
+      <w:r>
+        <w:t>": {</w:t>
+      </w:r>
+    </w:p>
+    <w:p>
+      <w:r>
+        <w:t xml:space="preserve">    "source": "</w:t>
+      </w:r>
+      <w:proofErr w:type="spellStart"/>
+      <w:r>
+        <w:t>theriaque</w:t>
+      </w:r>
+      <w:proofErr w:type="spellEnd"/>
+      <w:r>
+        <w:t>",</w:t>
+      </w:r>
+    </w:p>
+    <w:p>
+      <w:r>
+        <w:t xml:space="preserve">    "cis": "62869109",</w:t>
+      </w:r>
+    </w:p>
+    <w:p>
+      <w:r>
+        <w:t xml:space="preserve">    "</w:t>
+      </w:r>
+      <w:proofErr w:type="spellStart"/>
+      <w:r>
+        <w:t>sp_id</w:t>
+      </w:r>
+      <w:proofErr w:type="spellEnd"/>
+      <w:r>
+        <w:t>": "4552",</w:t>
+      </w:r>
+    </w:p>
+    <w:p>
+      <w:r>
+        <w:t xml:space="preserve">    "</w:t>
+      </w:r>
+      <w:proofErr w:type="spellStart"/>
+      <w:r>
+        <w:t>matched_by</w:t>
+      </w:r>
+      <w:proofErr w:type="spellEnd"/>
+      <w:r>
+        <w:t>": "cis",</w:t>
+      </w:r>
+    </w:p>
+    <w:p>
+      <w:r>
+        <w:t xml:space="preserve">    "</w:t>
+      </w:r>
+      <w:proofErr w:type="spellStart"/>
+      <w:r>
+        <w:t>last_updated_at</w:t>
+      </w:r>
+      <w:proofErr w:type="spellEnd"/>
+      <w:r>
+        <w:t>": 1768837457</w:t>
+      </w:r>
+    </w:p>
+    <w:p>
+      <w:r>
+        <w:t xml:space="preserve">  },</w:t>
+      </w:r>
+    </w:p>
+    <w:p>
+      <w:r>
+        <w:t xml:space="preserve">  "interactions": {</w:t>
+      </w:r>
+    </w:p>
+    <w:p>
+      <w:r>
+        <w:t xml:space="preserve">    "</w:t>
+      </w:r>
+      <w:proofErr w:type="spellStart"/>
+      <w:r>
+        <w:t>sp_id</w:t>
+      </w:r>
+      <w:proofErr w:type="spellEnd"/>
+      <w:r>
+        <w:t>": "4552",</w:t>
+      </w:r>
+    </w:p>
+    <w:p>
+      <w:r>
+        <w:t xml:space="preserve">    "url": "https://www.theriaque.org/apps/monographie/index.php?type=SP&amp;id=4552",</w:t>
+      </w:r>
+    </w:p>
+    <w:p>
+      <w:r>
+        <w:t xml:space="preserve">    "</w:t>
+      </w:r>
+      <w:proofErr w:type="spellStart"/>
+      <w:r>
+        <w:t>text</w:t>
+      </w:r>
+      <w:proofErr w:type="spellEnd"/>
+      <w:r>
+        <w:t>": "* Associations contre-indiquées\n\n- CYCLINES\n..."</w:t>
+      </w:r>
+    </w:p>
+    <w:p>
+      <w:r>
+        <w:t xml:space="preserve">  }</w:t>
+      </w:r>
+    </w:p>
+    <w:p>
+      <w:r>
+        <w:t>}</w:t>
+      </w:r>
+    </w:p>
+    <w:p>
+      <w:r>
+        <w:pict w14:anchorId="00CB5F89">
+          <v:rect id="_x0000_i1090" style="width:0;height:1.5pt" o:hralign="center" o:hrstd="t" o:hr="t" fillcolor="#a0a0a0" stroked="f"/>
+        </w:pict>
+      </w:r>
+    </w:p>
+    <w:p>
+      <w:pPr>
+        <w:rPr>
+          <w:b/>
+          <w:bCs/>
+        </w:rPr>
+      </w:pPr>
+      <w:r>
+        <w:rPr>
+          <w:b/>
+          <w:bCs/>
+        </w:rPr>
+        <w:t>6️</w:t>
+      </w:r>
+      <w:r>
+        <w:rPr>
+          <w:rFonts w:ascii="Segoe UI Symbol" w:hAnsi="Segoe UI Symbol" w:cs="Segoe UI Symbol"/>
+          <w:b/>
+          <w:bCs/>
+        </w:rPr>
+        <w:t>⃣</w:t>
+      </w:r>
+      <w:r>
+        <w:rPr>
+          <w:b/>
+          <w:bCs/>
+        </w:rPr>
+        <w:t xml:space="preserve"> Erreurs fréquentes (et solutions)</w:t>
+      </w:r>
+    </w:p>
+    <w:p>
+      <w:pPr>
+        <w:rPr>
+          <w:b/>
+          <w:bCs/>
+        </w:rPr>
+      </w:pPr>
+      <w:r>
+        <w:rPr>
+          <w:rFonts w:ascii="Segoe UI Emoji" w:hAnsi="Segoe UI Emoji" w:cs="Segoe UI Emoji"/>
+          <w:b/>
+          <w:bCs/>
+        </w:rPr>
+        <w:t>❌</w:t>
+      </w:r>
+      <w:r>
+        <w:rPr>
+          <w:b/>
+          <w:bCs/>
+        </w:rPr>
+        <w:t xml:space="preserve"> AUTH CHECK: NOT </w:t>
+      </w:r>
+      <w:proofErr w:type="spellStart"/>
+      <w:r>
+        <w:rPr>
+          <w:b/>
+          <w:bCs/>
+        </w:rPr>
+        <w:t>logged</w:t>
+      </w:r>
+      <w:proofErr w:type="spellEnd"/>
+      <w:r>
+        <w:rPr>
+          <w:b/>
+          <w:bCs/>
+        </w:rPr>
+        <w:t xml:space="preserve"> in</w:t>
+      </w:r>
+    </w:p>
+    <w:p>
+      <w:r>
+        <w:rPr>
+          <w:rFonts w:ascii="Segoe UI Emoji" w:hAnsi="Segoe UI Emoji" w:cs="Segoe UI Emoji"/>
+        </w:rPr>
+        <w:t>➡️</w:t>
+      </w:r>
+      <w:r>
+        <w:t xml:space="preserve"> Cookies invalides ou expirés</w:t>
+      </w:r>
+      <w:r>
+        <w:br/>
+      </w:r>
+      <w:r>
+        <w:rPr>
+          <w:rFonts w:ascii="Segoe UI Emoji" w:hAnsi="Segoe UI Emoji" w:cs="Segoe UI Emoji"/>
+        </w:rPr>
+        <w:t>✔️</w:t>
+      </w:r>
+      <w:r>
+        <w:t xml:space="preserve"> Recharger la page Thériaque</w:t>
+      </w:r>
+      <w:r>
+        <w:br/>
+      </w:r>
+      <w:r>
+        <w:rPr>
+          <w:rFonts w:ascii="Segoe UI Emoji" w:hAnsi="Segoe UI Emoji" w:cs="Segoe UI Emoji"/>
+        </w:rPr>
+        <w:t>✔️</w:t>
+      </w:r>
+      <w:r>
+        <w:t xml:space="preserve"> Reprendre </w:t>
+      </w:r>
+      <w:r>
+        <w:rPr>
+          <w:b/>
+          <w:bCs/>
+        </w:rPr>
+        <w:t xml:space="preserve">PHPSESSID + </w:t>
+      </w:r>
+      <w:proofErr w:type="spellStart"/>
+      <w:r>
+        <w:rPr>
+          <w:b/>
+          <w:bCs/>
+        </w:rPr>
+        <w:t>authchallenge</w:t>
+      </w:r>
+      <w:proofErr w:type="spellEnd"/>
+    </w:p>
+    <w:p>
+      <w:r>
+        <w:pict w14:anchorId="151CB9C1">
+          <v:rect id="_x0000_i1091" style="width:0;height:1.5pt" o:hralign="center" o:hrstd="t" o:hr="t" fillcolor="#a0a0a0" stroked="f"/>
+        </w:pict>
+      </w:r>
+    </w:p>
+    <w:p>
+      <w:pPr>
+        <w:rPr>
+          <w:b/>
+          <w:bCs/>
+        </w:rPr>
+      </w:pPr>
+      <w:r>
+        <w:rPr>
+          <w:rFonts w:ascii="Segoe UI Emoji" w:hAnsi="Segoe UI Emoji" w:cs="Segoe UI Emoji"/>
+          <w:b/>
+          <w:bCs/>
+        </w:rPr>
+        <w:lastRenderedPageBreak/>
+        <w:t>❌</w:t>
+      </w:r>
+      <w:r>
+        <w:rPr>
+          <w:b/>
+          <w:bCs/>
+        </w:rPr>
+        <w:t xml:space="preserve"> 0 document modifié</w:t>
+      </w:r>
+    </w:p>
+    <w:p>
+      <w:r>
+        <w:rPr>
+          <w:rFonts w:ascii="Segoe UI Emoji" w:hAnsi="Segoe UI Emoji" w:cs="Segoe UI Emoji"/>
+        </w:rPr>
+        <w:t>➡️</w:t>
+      </w:r>
+      <w:r>
+        <w:t xml:space="preserve"> Soit :</w:t>
+      </w:r>
+    </w:p>
+    <w:p>
+      <w:pPr>
+        <w:numPr>
+          <w:ilvl w:val="0"/>
+          <w:numId w:val="4"/>
+        </w:numPr>
+      </w:pPr>
+      <w:r>
+        <w:t>Mauvais cookies</w:t>
+      </w:r>
+    </w:p>
+    <w:p>
+      <w:pPr>
+        <w:numPr>
+          <w:ilvl w:val="0"/>
+          <w:numId w:val="4"/>
+        </w:numPr>
+      </w:pPr>
+      <w:r>
+        <w:t>Session expirée</w:t>
+      </w:r>
+    </w:p>
+    <w:p>
+      <w:pPr>
+        <w:numPr>
+          <w:ilvl w:val="0"/>
+          <w:numId w:val="4"/>
+        </w:numPr>
+      </w:pPr>
+      <w:r>
+        <w:t>Test sans données BDPM (CIS manquant)</w:t>
+      </w:r>
+    </w:p>
+    <w:p>
+      <w:r>
+        <w:pict w14:anchorId="0A0ED053">
+          <v:rect id="_x0000_i1092" style="width:0;height:1.5pt" o:hralign="center" o:hrstd="t" o:hr="t" fillcolor="#a0a0a0" stroked="f"/>
+        </w:pict>
+      </w:r>
+    </w:p>
+    <w:p>
+      <w:pPr>
+        <w:rPr>
+          <w:b/>
+          <w:bCs/>
+        </w:rPr>
+      </w:pPr>
+      <w:r>
+        <w:rPr>
+          <w:rFonts w:ascii="Segoe UI Emoji" w:hAnsi="Segoe UI Emoji" w:cs="Segoe UI Emoji"/>
+          <w:b/>
+          <w:bCs/>
+        </w:rPr>
+        <w:t>❌</w:t>
+      </w:r>
+      <w:r>
+        <w:rPr>
+          <w:b/>
+          <w:bCs/>
+        </w:rPr>
+        <w:t xml:space="preserve"> Présence de </w:t>
+      </w:r>
+      <w:proofErr w:type="spellStart"/>
+      <w:r>
+        <w:rPr>
+          <w:b/>
+          <w:bCs/>
+        </w:rPr>
+        <w:t>raw_text</w:t>
+      </w:r>
+      <w:proofErr w:type="spellEnd"/>
+      <w:r>
+        <w:rPr>
+          <w:b/>
+          <w:bCs/>
+        </w:rPr>
+        <w:t xml:space="preserve"> avec du JS</w:t>
+      </w:r>
+    </w:p>
+    <w:p>
+      <w:r>
+        <w:rPr>
+          <w:rFonts w:ascii="Segoe UI Emoji" w:hAnsi="Segoe UI Emoji" w:cs="Segoe UI Emoji"/>
+        </w:rPr>
+        <w:t>➡️</w:t>
+      </w:r>
+      <w:r>
+        <w:t xml:space="preserve"> Anciennes données (avant correction)</w:t>
+      </w:r>
+      <w:r>
+        <w:br/>
+      </w:r>
+      <w:r>
+        <w:rPr>
+          <w:rFonts w:ascii="Segoe UI Emoji" w:hAnsi="Segoe UI Emoji" w:cs="Segoe UI Emoji"/>
+        </w:rPr>
+        <w:t>✔️</w:t>
+      </w:r>
+      <w:r>
+        <w:t xml:space="preserve"> Le </w:t>
+      </w:r>
+      <w:proofErr w:type="spellStart"/>
+      <w:r>
+        <w:t>scraping</w:t>
+      </w:r>
+      <w:proofErr w:type="spellEnd"/>
+      <w:r>
+        <w:t xml:space="preserve"> actuel est correct</w:t>
+      </w:r>
+      <w:r>
+        <w:br/>
+      </w:r>
+      <w:r>
+        <w:rPr>
+          <w:rFonts w:ascii="Segoe UI Emoji" w:hAnsi="Segoe UI Emoji" w:cs="Segoe UI Emoji"/>
+        </w:rPr>
+        <w:t>✔️</w:t>
+      </w:r>
+      <w:r>
+        <w:t xml:space="preserve"> Un nettoyage Mongo peut être fait ensuite</w:t>
+      </w:r>
+    </w:p>
+    <w:p>
+      <w:r>
+        <w:pict w14:anchorId="755AA966">
+          <v:rect id="_x0000_i1093" style="width:0;height:1.5pt" o:hralign="center" o:hrstd="t" o:hr="t" fillcolor="#a0a0a0" stroked="f"/>
+        </w:pict>
+      </w:r>
+    </w:p>
+    <w:p>
+      <w:pPr>
+        <w:rPr>
+          <w:b/>
+          <w:bCs/>
+        </w:rPr>
+      </w:pPr>
+      <w:r>
+        <w:rPr>
+          <w:b/>
+          <w:bCs/>
+        </w:rPr>
+        <w:t>7️</w:t>
+      </w:r>
+      <w:r>
+        <w:rPr>
+          <w:rFonts w:ascii="Segoe UI Symbol" w:hAnsi="Segoe UI Symbol" w:cs="Segoe UI Symbol"/>
+          <w:b/>
+          <w:bCs/>
+        </w:rPr>
+        <w:t>⃣</w:t>
+      </w:r>
+      <w:r>
+        <w:rPr>
+          <w:b/>
+          <w:bCs/>
+        </w:rPr>
+        <w:t xml:space="preserve"> Bonnes pratiques</w:t>
+      </w:r>
+    </w:p>
+    <w:p>
+      <w:pPr>
+        <w:numPr>
+          <w:ilvl w:val="0"/>
+          <w:numId w:val="5"/>
+        </w:numPr>
+      </w:pPr>
+      <w:r>
+        <w:t>Toujours tester avec --</w:t>
+      </w:r>
+      <w:proofErr w:type="spellStart"/>
+      <w:r>
+        <w:t>limit</w:t>
+      </w:r>
+      <w:proofErr w:type="spellEnd"/>
+      <w:r>
+        <w:t xml:space="preserve"> 20</w:t>
+      </w:r>
+    </w:p>
+    <w:p>
+      <w:pPr>
+        <w:numPr>
+          <w:ilvl w:val="0"/>
+          <w:numId w:val="5"/>
+        </w:numPr>
+      </w:pPr>
+      <w:r>
+        <w:t xml:space="preserve">Ne jamais </w:t>
+      </w:r>
+      <w:proofErr w:type="spellStart"/>
+      <w:r>
+        <w:t>hardcoder</w:t>
+      </w:r>
+      <w:proofErr w:type="spellEnd"/>
+      <w:r>
+        <w:t xml:space="preserve"> les cookies</w:t>
+      </w:r>
+    </w:p>
+    <w:p>
+      <w:pPr>
+        <w:numPr>
+          <w:ilvl w:val="0"/>
+          <w:numId w:val="5"/>
+        </w:numPr>
+      </w:pPr>
+      <w:r>
+        <w:t xml:space="preserve">Relever les cookies </w:t>
+      </w:r>
+      <w:r>
+        <w:rPr>
+          <w:b/>
+          <w:bCs/>
+        </w:rPr>
+        <w:t>après connexion</w:t>
+      </w:r>
+    </w:p>
+    <w:p>
+      <w:pPr>
+        <w:numPr>
+          <w:ilvl w:val="0"/>
+          <w:numId w:val="5"/>
+        </w:numPr>
+      </w:pPr>
+      <w:r>
+        <w:t>Ne pas scraper sans authentification (bloqué)</w:t>
+      </w:r>
+    </w:p>
+    <w:p>
+      <w:r>
+        <w:pict w14:anchorId="32219AD0">
+          <v:rect id="_x0000_i1094" style="width:0;height:1.5pt" o:hralign="center" o:hrstd="t" o:hr="t" fillcolor="#a0a0a0" stroked="f"/>
+        </w:pict>
+      </w:r>
+    </w:p>
+    <w:p>
+      <w:pPr>
+        <w:rPr>
+          <w:b/>
+          <w:bCs/>
+        </w:rPr>
+      </w:pPr>
+      <w:r>
+        <w:rPr>
+          <w:rFonts w:ascii="Segoe UI Emoji" w:hAnsi="Segoe UI Emoji" w:cs="Segoe UI Emoji"/>
+          <w:b/>
+          <w:bCs/>
+        </w:rPr>
+        <w:t>✅</w:t>
+      </w:r>
+      <w:r>
+        <w:rPr>
+          <w:b/>
+          <w:bCs/>
+        </w:rPr>
+        <w:t xml:space="preserve"> Résumé ultra-court</w:t>
+      </w:r>
+    </w:p>
+    <w:p>
+      <w:pPr>
+        <w:numPr>
+          <w:ilvl w:val="0"/>
+          <w:numId w:val="6"/>
+        </w:numPr>
+      </w:pPr>
+      <w:r>
+        <w:t>Créer un compte Thériaque</w:t>
+      </w:r>
+    </w:p>
+    <w:p>
+      <w:pPr>
+        <w:numPr>
+          <w:ilvl w:val="0"/>
+          <w:numId w:val="6"/>
+        </w:numPr>
+      </w:pPr>
+      <w:r>
+        <w:t>Se connecter</w:t>
+      </w:r>
+    </w:p>
+    <w:p>
+      <w:pPr>
+        <w:numPr>
+          <w:ilvl w:val="0"/>
+          <w:numId w:val="6"/>
+        </w:numPr>
+      </w:pPr>
+      <w:r>
+        <w:t>F12 → Application → Cookies</w:t>
+      </w:r>
+    </w:p>
+    <w:p>
+      <w:pPr>
+        <w:numPr>
+          <w:ilvl w:val="0"/>
+          <w:numId w:val="6"/>
+        </w:numPr>
+      </w:pPr>
+      <w:r>
+        <w:t xml:space="preserve">Copier PHPSESSID + </w:t>
+      </w:r>
+      <w:proofErr w:type="spellStart"/>
+      <w:r>
+        <w:t>authchallenge</w:t>
+      </w:r>
+      <w:proofErr w:type="spellEnd"/>
+    </w:p>
+    <w:p>
+      <w:pPr>
+        <w:numPr>
+          <w:ilvl w:val="0"/>
+          <w:numId w:val="6"/>
+        </w:numPr>
+      </w:pPr>
+      <w:r>
+        <w:t>Lancer la commande CLI</w:t>
+      </w:r>
+    </w:p>
+    <w:p>
+      <w:pPr>
+        <w:numPr>
+          <w:ilvl w:val="0"/>
+          <w:numId w:val="6"/>
+        </w:numPr>
+      </w:pPr>
+      <w:r>
+        <w:t>Vérifier dans MongoDB Compass</w:t>
+      </w:r>
+    </w:p>
     <w:p/>
     <w:p/>
     <w:p/>
@@ -405,6 +2289,851 @@
     </w:sectPr>
   </w:body>
 </w:document>
+</file>
+
+<file path=word/numbering.xml><?xml version="1.0" encoding="utf-8"?>
+<w:numbering xmlns:wpc="http://schemas.microsoft.com/office/word/2010/wordprocessingCanvas" xmlns:cx="http://schemas.microsoft.com/office/drawing/2014/chartex" xmlns:cx1="http://schemas.microsoft.com/office/drawing/2015/9/8/chartex" xmlns:cx2="http://schemas.microsoft.com/office/drawing/2015/10/21/chartex" xmlns:cx3="http://schemas.microsoft.com/office/drawing/2016/5/9/chartex" xmlns:cx4="http://schemas.microsoft.com/office/drawing/2016/5/10/chartex" xmlns:cx5="http://schemas.microsoft.com/office/drawing/2016/5/11/chartex" xmlns:cx6="http://schemas.microsoft.com/office/drawing/2016/5/12/chartex" xmlns:cx7="http://schemas.microsoft.com/office/drawing/2016/5/13/chartex" xmlns:cx8="http://schemas.microsoft.com/office/drawing/2016/5/14/chartex" xmlns:mc="http://schemas.openxmlformats.org/markup-compatibility/2006" xmlns:aink="http://schemas.microsoft.com/office/drawing/2016/ink" xmlns:am3d="http://schemas.microsoft.com/office/drawing/2017/model3d" xmlns:o="urn:schemas-microsoft-com:office:office" xmlns:oel="http://schemas.microsoft.com/office/2019/extlst" xmlns:r="http://schemas.openxmlformats.org/officeDocument/2006/relationships" xmlns:m="http://schemas.openxmlformats.org/officeDocument/2006/math" xmlns:v="urn:schemas-microsoft-com:vml" xmlns:wp14="http://schemas.microsoft.com/office/word/2010/wordprocessingDrawing" xmlns:wp="http://schemas.openxmlformats.org/drawingml/2006/wordprocessingDrawing" xmlns:w10="urn:schemas-microsoft-com:office:word" xmlns:w="http://schemas.openxmlformats.org/wordprocessingml/2006/main" xmlns:w14="http://schemas.microsoft.com/office/word/2010/wordml" xmlns:w15="http://schemas.microsoft.com/office/word/2012/wordml" xmlns:w16cex="http://schemas.microsoft.com/office/word/2018/wordml/cex" xmlns:w16cid="http://schemas.microsoft.com/office/word/2016/wordml/cid" xmlns:w16="http://schemas.microsoft.com/office/word/2018/wordml" xmlns:w16du="http://schemas.microsoft.com/office/word/2023/wordml/word16du" xmlns:w16sdtdh="http://schemas.microsoft.com/office/word/2020/wordml/sdtdatahash" xmlns:w16sdtfl="http://schemas.microsoft.com/office/word/2024/wordml/sdtformatlock" xmlns:w16se="http://schemas.microsoft.com/office/word/2015/wordml/symex" xmlns:wpg="http://schemas.microsoft.com/office/word/2010/wordprocessingGroup" xmlns:wpi="http://schemas.microsoft.com/office/word/2010/wordprocessingInk" xmlns:wne="http://schemas.microsoft.com/office/word/2006/wordml" xmlns:wps="http://schemas.microsoft.com/office/word/2010/wordprocessingShape" mc:Ignorable="w14 w15 w16se w16cid w16 w16cex w16sdtdh w16sdtfl w16du wp14">
+  <w:abstractNum w:abstractNumId="0" w15:restartNumberingAfterBreak="0">
+    <w:nsid w:val="0B237139"/>
+    <w:multiLevelType w:val="multilevel"/>
+    <w:tmpl w:val="F09ADC08"/>
+    <w:lvl w:ilvl="0">
+      <w:start w:val="1"/>
+      <w:numFmt w:val="bullet"/>
+      <w:lvlText w:val=""/>
+      <w:lvlJc w:val="left"/>
+      <w:pPr>
+        <w:tabs>
+          <w:tab w:val="num" w:pos="720"/>
+        </w:tabs>
+        <w:ind w:left="720" w:hanging="360"/>
+      </w:pPr>
+      <w:rPr>
+        <w:rFonts w:ascii="Symbol" w:hAnsi="Symbol" w:hint="default"/>
+        <w:sz w:val="20"/>
+      </w:rPr>
+    </w:lvl>
+    <w:lvl w:ilvl="1" w:tentative="1">
+      <w:start w:val="1"/>
+      <w:numFmt w:val="bullet"/>
+      <w:lvlText w:val="o"/>
+      <w:lvlJc w:val="left"/>
+      <w:pPr>
+        <w:tabs>
+          <w:tab w:val="num" w:pos="1440"/>
+        </w:tabs>
+        <w:ind w:left="1440" w:hanging="360"/>
+      </w:pPr>
+      <w:rPr>
+        <w:rFonts w:ascii="Courier New" w:hAnsi="Courier New" w:hint="default"/>
+        <w:sz w:val="20"/>
+      </w:rPr>
+    </w:lvl>
+    <w:lvl w:ilvl="2" w:tentative="1">
+      <w:start w:val="1"/>
+      <w:numFmt w:val="bullet"/>
+      <w:lvlText w:val=""/>
+      <w:lvlJc w:val="left"/>
+      <w:pPr>
+        <w:tabs>
+          <w:tab w:val="num" w:pos="2160"/>
+        </w:tabs>
+        <w:ind w:left="2160" w:hanging="360"/>
+      </w:pPr>
+      <w:rPr>
+        <w:rFonts w:ascii="Wingdings" w:hAnsi="Wingdings" w:hint="default"/>
+        <w:sz w:val="20"/>
+      </w:rPr>
+    </w:lvl>
+    <w:lvl w:ilvl="3" w:tentative="1">
+      <w:start w:val="1"/>
+      <w:numFmt w:val="bullet"/>
+      <w:lvlText w:val=""/>
+      <w:lvlJc w:val="left"/>
+      <w:pPr>
+        <w:tabs>
+          <w:tab w:val="num" w:pos="2880"/>
+        </w:tabs>
+        <w:ind w:left="2880" w:hanging="360"/>
+      </w:pPr>
+      <w:rPr>
+        <w:rFonts w:ascii="Wingdings" w:hAnsi="Wingdings" w:hint="default"/>
+        <w:sz w:val="20"/>
+      </w:rPr>
+    </w:lvl>
+    <w:lvl w:ilvl="4" w:tentative="1">
+      <w:start w:val="1"/>
+      <w:numFmt w:val="bullet"/>
+      <w:lvlText w:val=""/>
+      <w:lvlJc w:val="left"/>
+      <w:pPr>
+        <w:tabs>
+          <w:tab w:val="num" w:pos="3600"/>
+        </w:tabs>
+        <w:ind w:left="3600" w:hanging="360"/>
+      </w:pPr>
+      <w:rPr>
+        <w:rFonts w:ascii="Wingdings" w:hAnsi="Wingdings" w:hint="default"/>
+        <w:sz w:val="20"/>
+      </w:rPr>
+    </w:lvl>
+    <w:lvl w:ilvl="5" w:tentative="1">
+      <w:start w:val="1"/>
+      <w:numFmt w:val="bullet"/>
+      <w:lvlText w:val=""/>
+      <w:lvlJc w:val="left"/>
+      <w:pPr>
+        <w:tabs>
+          <w:tab w:val="num" w:pos="4320"/>
+        </w:tabs>
+        <w:ind w:left="4320" w:hanging="360"/>
+      </w:pPr>
+      <w:rPr>
+        <w:rFonts w:ascii="Wingdings" w:hAnsi="Wingdings" w:hint="default"/>
+        <w:sz w:val="20"/>
+      </w:rPr>
+    </w:lvl>
+    <w:lvl w:ilvl="6" w:tentative="1">
+      <w:start w:val="1"/>
+      <w:numFmt w:val="bullet"/>
+      <w:lvlText w:val=""/>
+      <w:lvlJc w:val="left"/>
+      <w:pPr>
+        <w:tabs>
+          <w:tab w:val="num" w:pos="5040"/>
+        </w:tabs>
+        <w:ind w:left="5040" w:hanging="360"/>
+      </w:pPr>
+      <w:rPr>
+        <w:rFonts w:ascii="Wingdings" w:hAnsi="Wingdings" w:hint="default"/>
+        <w:sz w:val="20"/>
+      </w:rPr>
+    </w:lvl>
+    <w:lvl w:ilvl="7" w:tentative="1">
+      <w:start w:val="1"/>
+      <w:numFmt w:val="bullet"/>
+      <w:lvlText w:val=""/>
+      <w:lvlJc w:val="left"/>
+      <w:pPr>
+        <w:tabs>
+          <w:tab w:val="num" w:pos="5760"/>
+        </w:tabs>
+        <w:ind w:left="5760" w:hanging="360"/>
+      </w:pPr>
+      <w:rPr>
+        <w:rFonts w:ascii="Wingdings" w:hAnsi="Wingdings" w:hint="default"/>
+        <w:sz w:val="20"/>
+      </w:rPr>
+    </w:lvl>
+    <w:lvl w:ilvl="8" w:tentative="1">
+      <w:start w:val="1"/>
+      <w:numFmt w:val="bullet"/>
+      <w:lvlText w:val=""/>
+      <w:lvlJc w:val="left"/>
+      <w:pPr>
+        <w:tabs>
+          <w:tab w:val="num" w:pos="6480"/>
+        </w:tabs>
+        <w:ind w:left="6480" w:hanging="360"/>
+      </w:pPr>
+      <w:rPr>
+        <w:rFonts w:ascii="Wingdings" w:hAnsi="Wingdings" w:hint="default"/>
+        <w:sz w:val="20"/>
+      </w:rPr>
+    </w:lvl>
+  </w:abstractNum>
+  <w:abstractNum w:abstractNumId="1" w15:restartNumberingAfterBreak="0">
+    <w:nsid w:val="2F923CBF"/>
+    <w:multiLevelType w:val="multilevel"/>
+    <w:tmpl w:val="60D43490"/>
+    <w:lvl w:ilvl="0">
+      <w:start w:val="1"/>
+      <w:numFmt w:val="decimal"/>
+      <w:lvlText w:val="%1."/>
+      <w:lvlJc w:val="left"/>
+      <w:pPr>
+        <w:tabs>
+          <w:tab w:val="num" w:pos="720"/>
+        </w:tabs>
+        <w:ind w:left="720" w:hanging="360"/>
+      </w:pPr>
+    </w:lvl>
+    <w:lvl w:ilvl="1" w:tentative="1">
+      <w:start w:val="1"/>
+      <w:numFmt w:val="decimal"/>
+      <w:lvlText w:val="%2."/>
+      <w:lvlJc w:val="left"/>
+      <w:pPr>
+        <w:tabs>
+          <w:tab w:val="num" w:pos="1440"/>
+        </w:tabs>
+        <w:ind w:left="1440" w:hanging="360"/>
+      </w:pPr>
+    </w:lvl>
+    <w:lvl w:ilvl="2" w:tentative="1">
+      <w:start w:val="1"/>
+      <w:numFmt w:val="decimal"/>
+      <w:lvlText w:val="%3."/>
+      <w:lvlJc w:val="left"/>
+      <w:pPr>
+        <w:tabs>
+          <w:tab w:val="num" w:pos="2160"/>
+        </w:tabs>
+        <w:ind w:left="2160" w:hanging="360"/>
+      </w:pPr>
+    </w:lvl>
+    <w:lvl w:ilvl="3" w:tentative="1">
+      <w:start w:val="1"/>
+      <w:numFmt w:val="decimal"/>
+      <w:lvlText w:val="%4."/>
+      <w:lvlJc w:val="left"/>
+      <w:pPr>
+        <w:tabs>
+          <w:tab w:val="num" w:pos="2880"/>
+        </w:tabs>
+        <w:ind w:left="2880" w:hanging="360"/>
+      </w:pPr>
+    </w:lvl>
+    <w:lvl w:ilvl="4" w:tentative="1">
+      <w:start w:val="1"/>
+      <w:numFmt w:val="decimal"/>
+      <w:lvlText w:val="%5."/>
+      <w:lvlJc w:val="left"/>
+      <w:pPr>
+        <w:tabs>
+          <w:tab w:val="num" w:pos="3600"/>
+        </w:tabs>
+        <w:ind w:left="3600" w:hanging="360"/>
+      </w:pPr>
+    </w:lvl>
+    <w:lvl w:ilvl="5" w:tentative="1">
+      <w:start w:val="1"/>
+      <w:numFmt w:val="decimal"/>
+      <w:lvlText w:val="%6."/>
+      <w:lvlJc w:val="left"/>
+      <w:pPr>
+        <w:tabs>
+          <w:tab w:val="num" w:pos="4320"/>
+        </w:tabs>
+        <w:ind w:left="4320" w:hanging="360"/>
+      </w:pPr>
+    </w:lvl>
+    <w:lvl w:ilvl="6" w:tentative="1">
+      <w:start w:val="1"/>
+      <w:numFmt w:val="decimal"/>
+      <w:lvlText w:val="%7."/>
+      <w:lvlJc w:val="left"/>
+      <w:pPr>
+        <w:tabs>
+          <w:tab w:val="num" w:pos="5040"/>
+        </w:tabs>
+        <w:ind w:left="5040" w:hanging="360"/>
+      </w:pPr>
+    </w:lvl>
+    <w:lvl w:ilvl="7" w:tentative="1">
+      <w:start w:val="1"/>
+      <w:numFmt w:val="decimal"/>
+      <w:lvlText w:val="%8."/>
+      <w:lvlJc w:val="left"/>
+      <w:pPr>
+        <w:tabs>
+          <w:tab w:val="num" w:pos="5760"/>
+        </w:tabs>
+        <w:ind w:left="5760" w:hanging="360"/>
+      </w:pPr>
+    </w:lvl>
+    <w:lvl w:ilvl="8" w:tentative="1">
+      <w:start w:val="1"/>
+      <w:numFmt w:val="decimal"/>
+      <w:lvlText w:val="%9."/>
+      <w:lvlJc w:val="left"/>
+      <w:pPr>
+        <w:tabs>
+          <w:tab w:val="num" w:pos="6480"/>
+        </w:tabs>
+        <w:ind w:left="6480" w:hanging="360"/>
+      </w:pPr>
+    </w:lvl>
+  </w:abstractNum>
+  <w:abstractNum w:abstractNumId="2" w15:restartNumberingAfterBreak="0">
+    <w:nsid w:val="308A592E"/>
+    <w:multiLevelType w:val="multilevel"/>
+    <w:tmpl w:val="2884C970"/>
+    <w:lvl w:ilvl="0">
+      <w:start w:val="1"/>
+      <w:numFmt w:val="bullet"/>
+      <w:lvlText w:val=""/>
+      <w:lvlJc w:val="left"/>
+      <w:pPr>
+        <w:tabs>
+          <w:tab w:val="num" w:pos="720"/>
+        </w:tabs>
+        <w:ind w:left="720" w:hanging="360"/>
+      </w:pPr>
+      <w:rPr>
+        <w:rFonts w:ascii="Symbol" w:hAnsi="Symbol" w:hint="default"/>
+        <w:sz w:val="20"/>
+      </w:rPr>
+    </w:lvl>
+    <w:lvl w:ilvl="1" w:tentative="1">
+      <w:start w:val="1"/>
+      <w:numFmt w:val="bullet"/>
+      <w:lvlText w:val="o"/>
+      <w:lvlJc w:val="left"/>
+      <w:pPr>
+        <w:tabs>
+          <w:tab w:val="num" w:pos="1440"/>
+        </w:tabs>
+        <w:ind w:left="1440" w:hanging="360"/>
+      </w:pPr>
+      <w:rPr>
+        <w:rFonts w:ascii="Courier New" w:hAnsi="Courier New" w:hint="default"/>
+        <w:sz w:val="20"/>
+      </w:rPr>
+    </w:lvl>
+    <w:lvl w:ilvl="2" w:tentative="1">
+      <w:start w:val="1"/>
+      <w:numFmt w:val="bullet"/>
+      <w:lvlText w:val=""/>
+      <w:lvlJc w:val="left"/>
+      <w:pPr>
+        <w:tabs>
+          <w:tab w:val="num" w:pos="2160"/>
+        </w:tabs>
+        <w:ind w:left="2160" w:hanging="360"/>
+      </w:pPr>
+      <w:rPr>
+        <w:rFonts w:ascii="Wingdings" w:hAnsi="Wingdings" w:hint="default"/>
+        <w:sz w:val="20"/>
+      </w:rPr>
+    </w:lvl>
+    <w:lvl w:ilvl="3" w:tentative="1">
+      <w:start w:val="1"/>
+      <w:numFmt w:val="bullet"/>
+      <w:lvlText w:val=""/>
+      <w:lvlJc w:val="left"/>
+      <w:pPr>
+        <w:tabs>
+          <w:tab w:val="num" w:pos="2880"/>
+        </w:tabs>
+        <w:ind w:left="2880" w:hanging="360"/>
+      </w:pPr>
+      <w:rPr>
+        <w:rFonts w:ascii="Wingdings" w:hAnsi="Wingdings" w:hint="default"/>
+        <w:sz w:val="20"/>
+      </w:rPr>
+    </w:lvl>
+    <w:lvl w:ilvl="4" w:tentative="1">
+      <w:start w:val="1"/>
+      <w:numFmt w:val="bullet"/>
+      <w:lvlText w:val=""/>
+      <w:lvlJc w:val="left"/>
+      <w:pPr>
+        <w:tabs>
+          <w:tab w:val="num" w:pos="3600"/>
+        </w:tabs>
+        <w:ind w:left="3600" w:hanging="360"/>
+      </w:pPr>
+      <w:rPr>
+        <w:rFonts w:ascii="Wingdings" w:hAnsi="Wingdings" w:hint="default"/>
+        <w:sz w:val="20"/>
+      </w:rPr>
+    </w:lvl>
+    <w:lvl w:ilvl="5" w:tentative="1">
+      <w:start w:val="1"/>
+      <w:numFmt w:val="bullet"/>
+      <w:lvlText w:val=""/>
+      <w:lvlJc w:val="left"/>
+      <w:pPr>
+        <w:tabs>
+          <w:tab w:val="num" w:pos="4320"/>
+        </w:tabs>
+        <w:ind w:left="4320" w:hanging="360"/>
+      </w:pPr>
+      <w:rPr>
+        <w:rFonts w:ascii="Wingdings" w:hAnsi="Wingdings" w:hint="default"/>
+        <w:sz w:val="20"/>
+      </w:rPr>
+    </w:lvl>
+    <w:lvl w:ilvl="6" w:tentative="1">
+      <w:start w:val="1"/>
+      <w:numFmt w:val="bullet"/>
+      <w:lvlText w:val=""/>
+      <w:lvlJc w:val="left"/>
+      <w:pPr>
+        <w:tabs>
+          <w:tab w:val="num" w:pos="5040"/>
+        </w:tabs>
+        <w:ind w:left="5040" w:hanging="360"/>
+      </w:pPr>
+      <w:rPr>
+        <w:rFonts w:ascii="Wingdings" w:hAnsi="Wingdings" w:hint="default"/>
+        <w:sz w:val="20"/>
+      </w:rPr>
+    </w:lvl>
+    <w:lvl w:ilvl="7" w:tentative="1">
+      <w:start w:val="1"/>
+      <w:numFmt w:val="bullet"/>
+      <w:lvlText w:val=""/>
+      <w:lvlJc w:val="left"/>
+      <w:pPr>
+        <w:tabs>
+          <w:tab w:val="num" w:pos="5760"/>
+        </w:tabs>
+        <w:ind w:left="5760" w:hanging="360"/>
+      </w:pPr>
+      <w:rPr>
+        <w:rFonts w:ascii="Wingdings" w:hAnsi="Wingdings" w:hint="default"/>
+        <w:sz w:val="20"/>
+      </w:rPr>
+    </w:lvl>
+    <w:lvl w:ilvl="8" w:tentative="1">
+      <w:start w:val="1"/>
+      <w:numFmt w:val="bullet"/>
+      <w:lvlText w:val=""/>
+      <w:lvlJc w:val="left"/>
+      <w:pPr>
+        <w:tabs>
+          <w:tab w:val="num" w:pos="6480"/>
+        </w:tabs>
+        <w:ind w:left="6480" w:hanging="360"/>
+      </w:pPr>
+      <w:rPr>
+        <w:rFonts w:ascii="Wingdings" w:hAnsi="Wingdings" w:hint="default"/>
+        <w:sz w:val="20"/>
+      </w:rPr>
+    </w:lvl>
+  </w:abstractNum>
+  <w:abstractNum w:abstractNumId="3" w15:restartNumberingAfterBreak="0">
+    <w:nsid w:val="4E5439EE"/>
+    <w:multiLevelType w:val="multilevel"/>
+    <w:tmpl w:val="297CF71C"/>
+    <w:lvl w:ilvl="0">
+      <w:start w:val="1"/>
+      <w:numFmt w:val="bullet"/>
+      <w:lvlText w:val=""/>
+      <w:lvlJc w:val="left"/>
+      <w:pPr>
+        <w:tabs>
+          <w:tab w:val="num" w:pos="720"/>
+        </w:tabs>
+        <w:ind w:left="720" w:hanging="360"/>
+      </w:pPr>
+      <w:rPr>
+        <w:rFonts w:ascii="Symbol" w:hAnsi="Symbol" w:hint="default"/>
+        <w:sz w:val="20"/>
+      </w:rPr>
+    </w:lvl>
+    <w:lvl w:ilvl="1" w:tentative="1">
+      <w:start w:val="1"/>
+      <w:numFmt w:val="bullet"/>
+      <w:lvlText w:val="o"/>
+      <w:lvlJc w:val="left"/>
+      <w:pPr>
+        <w:tabs>
+          <w:tab w:val="num" w:pos="1440"/>
+        </w:tabs>
+        <w:ind w:left="1440" w:hanging="360"/>
+      </w:pPr>
+      <w:rPr>
+        <w:rFonts w:ascii="Courier New" w:hAnsi="Courier New" w:hint="default"/>
+        <w:sz w:val="20"/>
+      </w:rPr>
+    </w:lvl>
+    <w:lvl w:ilvl="2" w:tentative="1">
+      <w:start w:val="1"/>
+      <w:numFmt w:val="bullet"/>
+      <w:lvlText w:val=""/>
+      <w:lvlJc w:val="left"/>
+      <w:pPr>
+        <w:tabs>
+          <w:tab w:val="num" w:pos="2160"/>
+        </w:tabs>
+        <w:ind w:left="2160" w:hanging="360"/>
+      </w:pPr>
+      <w:rPr>
+        <w:rFonts w:ascii="Wingdings" w:hAnsi="Wingdings" w:hint="default"/>
+        <w:sz w:val="20"/>
+      </w:rPr>
+    </w:lvl>
+    <w:lvl w:ilvl="3" w:tentative="1">
+      <w:start w:val="1"/>
+      <w:numFmt w:val="bullet"/>
+      <w:lvlText w:val=""/>
+      <w:lvlJc w:val="left"/>
+      <w:pPr>
+        <w:tabs>
+          <w:tab w:val="num" w:pos="2880"/>
+        </w:tabs>
+        <w:ind w:left="2880" w:hanging="360"/>
+      </w:pPr>
+      <w:rPr>
+        <w:rFonts w:ascii="Wingdings" w:hAnsi="Wingdings" w:hint="default"/>
+        <w:sz w:val="20"/>
+      </w:rPr>
+    </w:lvl>
+    <w:lvl w:ilvl="4" w:tentative="1">
+      <w:start w:val="1"/>
+      <w:numFmt w:val="bullet"/>
+      <w:lvlText w:val=""/>
+      <w:lvlJc w:val="left"/>
+      <w:pPr>
+        <w:tabs>
+          <w:tab w:val="num" w:pos="3600"/>
+        </w:tabs>
+        <w:ind w:left="3600" w:hanging="360"/>
+      </w:pPr>
+      <w:rPr>
+        <w:rFonts w:ascii="Wingdings" w:hAnsi="Wingdings" w:hint="default"/>
+        <w:sz w:val="20"/>
+      </w:rPr>
+    </w:lvl>
+    <w:lvl w:ilvl="5" w:tentative="1">
+      <w:start w:val="1"/>
+      <w:numFmt w:val="bullet"/>
+      <w:lvlText w:val=""/>
+      <w:lvlJc w:val="left"/>
+      <w:pPr>
+        <w:tabs>
+          <w:tab w:val="num" w:pos="4320"/>
+        </w:tabs>
+        <w:ind w:left="4320" w:hanging="360"/>
+      </w:pPr>
+      <w:rPr>
+        <w:rFonts w:ascii="Wingdings" w:hAnsi="Wingdings" w:hint="default"/>
+        <w:sz w:val="20"/>
+      </w:rPr>
+    </w:lvl>
+    <w:lvl w:ilvl="6" w:tentative="1">
+      <w:start w:val="1"/>
+      <w:numFmt w:val="bullet"/>
+      <w:lvlText w:val=""/>
+      <w:lvlJc w:val="left"/>
+      <w:pPr>
+        <w:tabs>
+          <w:tab w:val="num" w:pos="5040"/>
+        </w:tabs>
+        <w:ind w:left="5040" w:hanging="360"/>
+      </w:pPr>
+      <w:rPr>
+        <w:rFonts w:ascii="Wingdings" w:hAnsi="Wingdings" w:hint="default"/>
+        <w:sz w:val="20"/>
+      </w:rPr>
+    </w:lvl>
+    <w:lvl w:ilvl="7" w:tentative="1">
+      <w:start w:val="1"/>
+      <w:numFmt w:val="bullet"/>
+      <w:lvlText w:val=""/>
+      <w:lvlJc w:val="left"/>
+      <w:pPr>
+        <w:tabs>
+          <w:tab w:val="num" w:pos="5760"/>
+        </w:tabs>
+        <w:ind w:left="5760" w:hanging="360"/>
+      </w:pPr>
+      <w:rPr>
+        <w:rFonts w:ascii="Wingdings" w:hAnsi="Wingdings" w:hint="default"/>
+        <w:sz w:val="20"/>
+      </w:rPr>
+    </w:lvl>
+    <w:lvl w:ilvl="8" w:tentative="1">
+      <w:start w:val="1"/>
+      <w:numFmt w:val="bullet"/>
+      <w:lvlText w:val=""/>
+      <w:lvlJc w:val="left"/>
+      <w:pPr>
+        <w:tabs>
+          <w:tab w:val="num" w:pos="6480"/>
+        </w:tabs>
+        <w:ind w:left="6480" w:hanging="360"/>
+      </w:pPr>
+      <w:rPr>
+        <w:rFonts w:ascii="Wingdings" w:hAnsi="Wingdings" w:hint="default"/>
+        <w:sz w:val="20"/>
+      </w:rPr>
+    </w:lvl>
+  </w:abstractNum>
+  <w:abstractNum w:abstractNumId="4" w15:restartNumberingAfterBreak="0">
+    <w:nsid w:val="5C224F44"/>
+    <w:multiLevelType w:val="multilevel"/>
+    <w:tmpl w:val="457E4F12"/>
+    <w:lvl w:ilvl="0">
+      <w:start w:val="1"/>
+      <w:numFmt w:val="bullet"/>
+      <w:lvlText w:val=""/>
+      <w:lvlJc w:val="left"/>
+      <w:pPr>
+        <w:tabs>
+          <w:tab w:val="num" w:pos="720"/>
+        </w:tabs>
+        <w:ind w:left="720" w:hanging="360"/>
+      </w:pPr>
+      <w:rPr>
+        <w:rFonts w:ascii="Symbol" w:hAnsi="Symbol" w:hint="default"/>
+        <w:sz w:val="20"/>
+      </w:rPr>
+    </w:lvl>
+    <w:lvl w:ilvl="1" w:tentative="1">
+      <w:start w:val="1"/>
+      <w:numFmt w:val="bullet"/>
+      <w:lvlText w:val="o"/>
+      <w:lvlJc w:val="left"/>
+      <w:pPr>
+        <w:tabs>
+          <w:tab w:val="num" w:pos="1440"/>
+        </w:tabs>
+        <w:ind w:left="1440" w:hanging="360"/>
+      </w:pPr>
+      <w:rPr>
+        <w:rFonts w:ascii="Courier New" w:hAnsi="Courier New" w:hint="default"/>
+        <w:sz w:val="20"/>
+      </w:rPr>
+    </w:lvl>
+    <w:lvl w:ilvl="2" w:tentative="1">
+      <w:start w:val="1"/>
+      <w:numFmt w:val="bullet"/>
+      <w:lvlText w:val=""/>
+      <w:lvlJc w:val="left"/>
+      <w:pPr>
+        <w:tabs>
+          <w:tab w:val="num" w:pos="2160"/>
+        </w:tabs>
+        <w:ind w:left="2160" w:hanging="360"/>
+      </w:pPr>
+      <w:rPr>
+        <w:rFonts w:ascii="Wingdings" w:hAnsi="Wingdings" w:hint="default"/>
+        <w:sz w:val="20"/>
+      </w:rPr>
+    </w:lvl>
+    <w:lvl w:ilvl="3" w:tentative="1">
+      <w:start w:val="1"/>
+      <w:numFmt w:val="bullet"/>
+      <w:lvlText w:val=""/>
+      <w:lvlJc w:val="left"/>
+      <w:pPr>
+        <w:tabs>
+          <w:tab w:val="num" w:pos="2880"/>
+        </w:tabs>
+        <w:ind w:left="2880" w:hanging="360"/>
+      </w:pPr>
+      <w:rPr>
+        <w:rFonts w:ascii="Wingdings" w:hAnsi="Wingdings" w:hint="default"/>
+        <w:sz w:val="20"/>
+      </w:rPr>
+    </w:lvl>
+    <w:lvl w:ilvl="4" w:tentative="1">
+      <w:start w:val="1"/>
+      <w:numFmt w:val="bullet"/>
+      <w:lvlText w:val=""/>
+      <w:lvlJc w:val="left"/>
+      <w:pPr>
+        <w:tabs>
+          <w:tab w:val="num" w:pos="3600"/>
+        </w:tabs>
+        <w:ind w:left="3600" w:hanging="360"/>
+      </w:pPr>
+      <w:rPr>
+        <w:rFonts w:ascii="Wingdings" w:hAnsi="Wingdings" w:hint="default"/>
+        <w:sz w:val="20"/>
+      </w:rPr>
+    </w:lvl>
+    <w:lvl w:ilvl="5" w:tentative="1">
+      <w:start w:val="1"/>
+      <w:numFmt w:val="bullet"/>
+      <w:lvlText w:val=""/>
+      <w:lvlJc w:val="left"/>
+      <w:pPr>
+        <w:tabs>
+          <w:tab w:val="num" w:pos="4320"/>
+        </w:tabs>
+        <w:ind w:left="4320" w:hanging="360"/>
+      </w:pPr>
+      <w:rPr>
+        <w:rFonts w:ascii="Wingdings" w:hAnsi="Wingdings" w:hint="default"/>
+        <w:sz w:val="20"/>
+      </w:rPr>
+    </w:lvl>
+    <w:lvl w:ilvl="6" w:tentative="1">
+      <w:start w:val="1"/>
+      <w:numFmt w:val="bullet"/>
+      <w:lvlText w:val=""/>
+      <w:lvlJc w:val="left"/>
+      <w:pPr>
+        <w:tabs>
+          <w:tab w:val="num" w:pos="5040"/>
+        </w:tabs>
+        <w:ind w:left="5040" w:hanging="360"/>
+      </w:pPr>
+      <w:rPr>
+        <w:rFonts w:ascii="Wingdings" w:hAnsi="Wingdings" w:hint="default"/>
+        <w:sz w:val="20"/>
+      </w:rPr>
+    </w:lvl>
+    <w:lvl w:ilvl="7" w:tentative="1">
+      <w:start w:val="1"/>
+      <w:numFmt w:val="bullet"/>
+      <w:lvlText w:val=""/>
+      <w:lvlJc w:val="left"/>
+      <w:pPr>
+        <w:tabs>
+          <w:tab w:val="num" w:pos="5760"/>
+        </w:tabs>
+        <w:ind w:left="5760" w:hanging="360"/>
+      </w:pPr>
+      <w:rPr>
+        <w:rFonts w:ascii="Wingdings" w:hAnsi="Wingdings" w:hint="default"/>
+        <w:sz w:val="20"/>
+      </w:rPr>
+    </w:lvl>
+    <w:lvl w:ilvl="8" w:tentative="1">
+      <w:start w:val="1"/>
+      <w:numFmt w:val="bullet"/>
+      <w:lvlText w:val=""/>
+      <w:lvlJc w:val="left"/>
+      <w:pPr>
+        <w:tabs>
+          <w:tab w:val="num" w:pos="6480"/>
+        </w:tabs>
+        <w:ind w:left="6480" w:hanging="360"/>
+      </w:pPr>
+      <w:rPr>
+        <w:rFonts w:ascii="Wingdings" w:hAnsi="Wingdings" w:hint="default"/>
+        <w:sz w:val="20"/>
+      </w:rPr>
+    </w:lvl>
+  </w:abstractNum>
+  <w:abstractNum w:abstractNumId="5" w15:restartNumberingAfterBreak="0">
+    <w:nsid w:val="7C22086E"/>
+    <w:multiLevelType w:val="multilevel"/>
+    <w:tmpl w:val="0826152C"/>
+    <w:lvl w:ilvl="0">
+      <w:start w:val="1"/>
+      <w:numFmt w:val="decimal"/>
+      <w:lvlText w:val="%1."/>
+      <w:lvlJc w:val="left"/>
+      <w:pPr>
+        <w:tabs>
+          <w:tab w:val="num" w:pos="720"/>
+        </w:tabs>
+        <w:ind w:left="720" w:hanging="360"/>
+      </w:pPr>
+    </w:lvl>
+    <w:lvl w:ilvl="1" w:tentative="1">
+      <w:start w:val="1"/>
+      <w:numFmt w:val="decimal"/>
+      <w:lvlText w:val="%2."/>
+      <w:lvlJc w:val="left"/>
+      <w:pPr>
+        <w:tabs>
+          <w:tab w:val="num" w:pos="1440"/>
+        </w:tabs>
+        <w:ind w:left="1440" w:hanging="360"/>
+      </w:pPr>
+    </w:lvl>
+    <w:lvl w:ilvl="2" w:tentative="1">
+      <w:start w:val="1"/>
+      <w:numFmt w:val="decimal"/>
+      <w:lvlText w:val="%3."/>
+      <w:lvlJc w:val="left"/>
+      <w:pPr>
+        <w:tabs>
+          <w:tab w:val="num" w:pos="2160"/>
+        </w:tabs>
+        <w:ind w:left="2160" w:hanging="360"/>
+      </w:pPr>
+    </w:lvl>
+    <w:lvl w:ilvl="3" w:tentative="1">
+      <w:start w:val="1"/>
+      <w:numFmt w:val="decimal"/>
+      <w:lvlText w:val="%4."/>
+      <w:lvlJc w:val="left"/>
+      <w:pPr>
+        <w:tabs>
+          <w:tab w:val="num" w:pos="2880"/>
+        </w:tabs>
+        <w:ind w:left="2880" w:hanging="360"/>
+      </w:pPr>
+    </w:lvl>
+    <w:lvl w:ilvl="4" w:tentative="1">
+      <w:start w:val="1"/>
+      <w:numFmt w:val="decimal"/>
+      <w:lvlText w:val="%5."/>
+      <w:lvlJc w:val="left"/>
+      <w:pPr>
+        <w:tabs>
+          <w:tab w:val="num" w:pos="3600"/>
+        </w:tabs>
+        <w:ind w:left="3600" w:hanging="360"/>
+      </w:pPr>
+    </w:lvl>
+    <w:lvl w:ilvl="5" w:tentative="1">
+      <w:start w:val="1"/>
+      <w:numFmt w:val="decimal"/>
+      <w:lvlText w:val="%6."/>
+      <w:lvlJc w:val="left"/>
+      <w:pPr>
+        <w:tabs>
+          <w:tab w:val="num" w:pos="4320"/>
+        </w:tabs>
+        <w:ind w:left="4320" w:hanging="360"/>
+      </w:pPr>
+    </w:lvl>
+    <w:lvl w:ilvl="6" w:tentative="1">
+      <w:start w:val="1"/>
+      <w:numFmt w:val="decimal"/>
+      <w:lvlText w:val="%7."/>
+      <w:lvlJc w:val="left"/>
+      <w:pPr>
+        <w:tabs>
+          <w:tab w:val="num" w:pos="5040"/>
+        </w:tabs>
+        <w:ind w:left="5040" w:hanging="360"/>
+      </w:pPr>
+    </w:lvl>
+    <w:lvl w:ilvl="7" w:tentative="1">
+      <w:start w:val="1"/>
+      <w:numFmt w:val="decimal"/>
+      <w:lvlText w:val="%8."/>
+      <w:lvlJc w:val="left"/>
+      <w:pPr>
+        <w:tabs>
+          <w:tab w:val="num" w:pos="5760"/>
+        </w:tabs>
+        <w:ind w:left="5760" w:hanging="360"/>
+      </w:pPr>
+    </w:lvl>
+    <w:lvl w:ilvl="8" w:tentative="1">
+      <w:start w:val="1"/>
+      <w:numFmt w:val="decimal"/>
+      <w:lvlText w:val="%9."/>
+      <w:lvlJc w:val="left"/>
+      <w:pPr>
+        <w:tabs>
+          <w:tab w:val="num" w:pos="6480"/>
+        </w:tabs>
+        <w:ind w:left="6480" w:hanging="360"/>
+      </w:pPr>
+    </w:lvl>
+  </w:abstractNum>
+  <w:num w:numId="1" w16cid:durableId="2141994483">
+    <w:abstractNumId w:val="1"/>
+  </w:num>
+  <w:num w:numId="2" w16cid:durableId="1744982786">
+    <w:abstractNumId w:val="4"/>
+  </w:num>
+  <w:num w:numId="3" w16cid:durableId="1606956220">
+    <w:abstractNumId w:val="0"/>
+  </w:num>
+  <w:num w:numId="4" w16cid:durableId="1153713447">
+    <w:abstractNumId w:val="3"/>
+  </w:num>
+  <w:num w:numId="5" w16cid:durableId="944385690">
+    <w:abstractNumId w:val="2"/>
+  </w:num>
+  <w:num w:numId="6" w16cid:durableId="1359620820">
+    <w:abstractNumId w:val="5"/>
+  </w:num>
+</w:numbering>
 </file>
 
 <file path=word/styles.xml><?xml version="1.0" encoding="utf-8"?>
@@ -1010,7 +3739,6 @@
   <w:style w:type="character" w:default="1" w:styleId="Policepardfaut">
     <w:name w:val="Default Paragraph Font"/>
     <w:uiPriority w:val="1"/>
-    <w:semiHidden/>
     <w:unhideWhenUsed/>
   </w:style>
   <w:style w:type="table" w:default="1" w:styleId="TableauNormal">
@@ -1324,6 +4052,29 @@
       <w:spacing w:val="5"/>
     </w:rPr>
   </w:style>
+  <w:style w:type="character" w:styleId="Lienhypertexte">
+    <w:name w:val="Hyperlink"/>
+    <w:basedOn w:val="Policepardfaut"/>
+    <w:uiPriority w:val="99"/>
+    <w:unhideWhenUsed/>
+    <w:rsid w:val="0088282B"/>
+    <w:rPr>
+      <w:color w:val="467886" w:themeColor="hyperlink"/>
+      <w:u w:val="single"/>
+    </w:rPr>
+  </w:style>
+  <w:style w:type="character" w:styleId="Mentionnonrsolue">
+    <w:name w:val="Unresolved Mention"/>
+    <w:basedOn w:val="Policepardfaut"/>
+    <w:uiPriority w:val="99"/>
+    <w:semiHidden/>
+    <w:unhideWhenUsed/>
+    <w:rsid w:val="0088282B"/>
+    <w:rPr>
+      <w:color w:val="605E5C"/>
+      <w:shd w:val="clear" w:color="auto" w:fill="E1DFDD"/>
+    </w:rPr>
+  </w:style>
 </w:styles>
 </file>
 

</xml_diff>